<commit_message>
Rewrite CPP102 Week 4 assessment bank v2 with new problem set
</commit_message>
<xml_diff>
--- a/CPP102-Programming-Logic-and-Design/Week04/CPP102_Week4_Assessment_Test_Question_Bank_v2.docx
+++ b/CPP102-Programming-Logic-and-Design/Week04/CPP102_Week4_Assessment_Test_Question_Bank_v2.docx
@@ -466,7 +466,7 @@
                 <w:sz w:val="24"/>
                 <w:szCs w:val="24"/>
               </w:rPr>
-              <w:t xml:space="preserve">quiz_score</w:t>
+              <w:t xml:space="preserve">customer_name</w:t>
             </w:r>
           </w:p>
         </w:tc>
@@ -626,7 +626,7 @@
                 <w:sz w:val="24"/>
                 <w:szCs w:val="24"/>
               </w:rPr>
-              <w:t xml:space="preserve">3rd_attempt</w:t>
+              <w:t xml:space="preserve">1st_place</w:t>
             </w:r>
           </w:p>
         </w:tc>
@@ -786,7 +786,7 @@
                 <w:sz w:val="24"/>
                 <w:szCs w:val="24"/>
               </w:rPr>
-              <w:t xml:space="preserve">student-name</w:t>
+              <w:t xml:space="preserve">item#price</w:t>
             </w:r>
           </w:p>
         </w:tc>
@@ -946,7 +946,7 @@
                 <w:sz w:val="24"/>
                 <w:szCs w:val="24"/>
               </w:rPr>
-              <w:t xml:space="preserve">total amount</w:t>
+              <w:t xml:space="preserve">monthly income</w:t>
             </w:r>
           </w:p>
         </w:tc>
@@ -1106,7 +1106,7 @@
                 <w:sz w:val="24"/>
                 <w:szCs w:val="24"/>
               </w:rPr>
-              <w:t xml:space="preserve">return</w:t>
+              <w:t xml:space="preserve">global</w:t>
             </w:r>
           </w:p>
         </w:tc>
@@ -1279,7 +1279,7 @@
                 <w:sz w:val="23"/>
                 <w:szCs w:val="23"/>
               </w:rPr>
-              <w:t xml:space="preserve">Explain why "2nd_quiz" is an invalid identifier, then rewrite it as a valid identifier.</w:t>
+              <w:t xml:space="preserve">Explain why "grade-level" is an invalid identifier, then rewrite it as a valid identifier.</w:t>
             </w:r>
           </w:p>
           <w:p>
@@ -1439,7 +1439,7 @@
                 <w:sz w:val="23"/>
                 <w:szCs w:val="23"/>
               </w:rPr>
-              <w:t xml:space="preserve">Explain why "electric-bill" is an invalid identifier, then rewrite it as a valid identifier.</w:t>
+              <w:t xml:space="preserve">Explain why "5th_floor" is an invalid identifier, then rewrite it as a valid identifier.</w:t>
             </w:r>
           </w:p>
           <w:p>
@@ -1599,7 +1599,7 @@
                 <w:sz w:val="23"/>
                 <w:szCs w:val="23"/>
               </w:rPr>
-              <w:t xml:space="preserve">Python identifiers are case-sensitive. Are "Distance" and "distance" the same variable? Explain your answer with a short example.</w:t>
+              <w:t xml:space="preserve">Python identifiers are case-sensitive. Are "Score" and "score" the same variable? Explain your answer with a short example.</w:t>
             </w:r>
           </w:p>
           <w:p>
@@ -1759,7 +1759,7 @@
                 <w:sz w:val="23"/>
                 <w:szCs w:val="23"/>
               </w:rPr>
-              <w:t xml:space="preserve">A program will record a student's name, the unit price of a school item, the quantity bought, and the total amount to be paid. Suggest one appropriate and valid Python identifier for each of these four values.</w:t>
+              <w:t xml:space="preserve">A payroll program will record an employee's ID number, monthly salary, number of dependents, and net pay. Suggest one appropriate and valid Python identifier for each of these four values.</w:t>
             </w:r>
           </w:p>
           <w:p>
@@ -1919,7 +1919,7 @@
                 <w:sz w:val="23"/>
                 <w:szCs w:val="23"/>
               </w:rPr>
-              <w:t xml:space="preserve">A household electricity-monitoring program needs variables for: the previous meter reading, the current meter reading, the consumption in kilowatt-hours, and the total electric bill in pesos. Suggest a valid identifier for each of the four values, and identify which of the four is most likely to require the float data type. Explain why.</w:t>
+              <w:t xml:space="preserve">A water-billing program needs variables for: the previous meter reading, the current meter reading, the cubic meters consumed, and the total water bill in pesos. Suggest a valid identifier for each of the four values, and identify which of the four is most likely to require the float data type. Explain why.</w:t>
             </w:r>
           </w:p>
           <w:p>
@@ -2109,7 +2109,7 @@
                 <w:sz w:val="23"/>
                 <w:szCs w:val="23"/>
               </w:rPr>
-              <w:t xml:space="preserve">What data type does the value 25 belong to in Python?</w:t>
+              <w:t xml:space="preserve">What data type does the value 100 belong to in Python?</w:t>
             </w:r>
           </w:p>
           <w:p>
@@ -2253,7 +2253,7 @@
                 <w:sz w:val="23"/>
                 <w:szCs w:val="23"/>
               </w:rPr>
-              <w:t xml:space="preserve">What data type does the value 3.14 belong to in Python?</w:t>
+              <w:t xml:space="preserve">What data type does the value 12.5 belong to in Python?</w:t>
             </w:r>
           </w:p>
           <w:p>
@@ -2397,7 +2397,7 @@
                 <w:sz w:val="23"/>
                 <w:szCs w:val="23"/>
               </w:rPr>
-              <w:t xml:space="preserve">What data type does the value "Hello" belong to in Python?</w:t>
+              <w:t xml:space="preserve">What data type does the value "Python" belong to in Python?</w:t>
             </w:r>
           </w:p>
           <w:p>
@@ -2541,7 +2541,7 @@
                 <w:sz w:val="23"/>
                 <w:szCs w:val="23"/>
               </w:rPr>
-              <w:t xml:space="preserve">What data type does the value True belong to in Python?</w:t>
+              <w:t xml:space="preserve">What data type does the value False belong to in Python?</w:t>
             </w:r>
           </w:p>
           <w:p>
@@ -2685,7 +2685,7 @@
                 <w:sz w:val="23"/>
                 <w:szCs w:val="23"/>
               </w:rPr>
-              <w:t xml:space="preserve">A program contains: age = input("Enter your age: "). If the user types 18, what is the data type of age, and why?</w:t>
+              <w:t xml:space="preserve">A program contains: name = input("Enter your name: "). If the user types Juan, what is the data type of name, and why?</w:t>
             </w:r>
           </w:p>
           <w:p>
@@ -2861,7 +2861,7 @@
                 <w:sz w:val="23"/>
                 <w:szCs w:val="23"/>
               </w:rPr>
-              <w:t xml:space="preserve">A program asks for the number of notebooks and their unit price, then multiplies them. Write the Python statements (with proper type conversion) so the two input values can be multiplied correctly.</w:t>
+              <w:t xml:space="preserve">A program asks for the number of hours studied and the number of pages read, then multiplies them to estimate pages per study session. Write the Python statements (with proper type conversion) so the two input values can be multiplied correctly.</w:t>
             </w:r>
           </w:p>
           <w:p>
@@ -3005,7 +3005,7 @@
                 <w:sz w:val="23"/>
                 <w:szCs w:val="23"/>
               </w:rPr>
-              <w:t xml:space="preserve">A program has: name = "Ana" and age = 20, then executes print(name + age). Explain what happens, and correct the statement so it works.</w:t>
+              <w:t xml:space="preserve">A program has: subject = "Math" and grade = 95, then executes print(subject + grade). Explain what happens, and correct the statement so it works.</w:t>
             </w:r>
           </w:p>
           <w:p>
@@ -3181,7 +3181,7 @@
                 <w:sz w:val="23"/>
                 <w:szCs w:val="23"/>
               </w:rPr>
-              <w:t xml:space="preserve">A payroll program has: hours = input("Enter hours worked: ") and rate = input("Enter hourly rate: "), then computes pay = hours * rate. Explain the error this produces, and rewrite the program so it computes correctly.</w:t>
+              <w:t xml:space="preserve">A shopping-cart program has: qty = input("Enter quantity: ") and price = input("Enter price: "), then computes total = qty * price. Explain the error this produces, and rewrite the program so it computes correctly.</w:t>
             </w:r>
           </w:p>
           <w:p>
@@ -3357,7 +3357,7 @@
                 <w:sz w:val="23"/>
                 <w:szCs w:val="23"/>
               </w:rPr>
-              <w:t xml:space="preserve">What data type does float(input(...)) always produce, as long as the user enters a valid number?</w:t>
+              <w:t xml:space="preserve">What data type does int(input(...)) always produce, as long as the user enters a valid whole number?</w:t>
             </w:r>
           </w:p>
           <w:p>
@@ -3751,7 +3751,7 @@
                 <w:sz w:val="24"/>
                 <w:szCs w:val="24"/>
               </w:rPr>
-              <w:t xml:space="preserve">18 + 2 * 5</w:t>
+              <w:t xml:space="preserve">22 + 3 * 4</w:t>
             </w:r>
           </w:p>
         </w:tc>
@@ -3911,7 +3911,7 @@
                 <w:sz w:val="24"/>
                 <w:szCs w:val="24"/>
               </w:rPr>
-              <w:t xml:space="preserve">(18 + 2) * 5</w:t>
+              <w:t xml:space="preserve">(22 + 3) * 4</w:t>
             </w:r>
           </w:p>
         </w:tc>
@@ -4071,7 +4071,7 @@
                 <w:sz w:val="24"/>
                 <w:szCs w:val="24"/>
               </w:rPr>
-              <w:t xml:space="preserve">29 // 6</w:t>
+              <w:t xml:space="preserve">45 // 7</w:t>
             </w:r>
           </w:p>
         </w:tc>
@@ -4231,7 +4231,7 @@
                 <w:sz w:val="24"/>
                 <w:szCs w:val="24"/>
               </w:rPr>
-              <w:t xml:space="preserve">29 % 6</w:t>
+              <w:t xml:space="preserve">45 % 7</w:t>
             </w:r>
           </w:p>
         </w:tc>
@@ -4391,7 +4391,7 @@
                 <w:sz w:val="24"/>
                 <w:szCs w:val="24"/>
               </w:rPr>
-              <w:t xml:space="preserve">4 ** 3</w:t>
+              <w:t xml:space="preserve">5 ** 3</w:t>
             </w:r>
           </w:p>
         </w:tc>
@@ -4551,7 +4551,7 @@
                 <w:sz w:val="24"/>
                 <w:szCs w:val="24"/>
               </w:rPr>
-              <w:t xml:space="preserve">15 - 8 / 4</w:t>
+              <w:t xml:space="preserve">20 - 9 / 3</w:t>
             </w:r>
           </w:p>
         </w:tc>
@@ -4711,7 +4711,7 @@
                 <w:sz w:val="24"/>
                 <w:szCs w:val="24"/>
               </w:rPr>
-              <w:t xml:space="preserve">12 == 12 and 7 &gt; 10</w:t>
+              <w:t xml:space="preserve">15 == 15 and 4 &gt; 9</w:t>
             </w:r>
           </w:p>
         </w:tc>
@@ -4871,7 +4871,7 @@
                 <w:sz w:val="24"/>
                 <w:szCs w:val="24"/>
               </w:rPr>
-              <w:t xml:space="preserve">not (9 &lt;= 3)</w:t>
+              <w:t xml:space="preserve">not (6 &lt;= 2)</w:t>
             </w:r>
           </w:p>
         </w:tc>
@@ -5031,7 +5031,7 @@
                 <w:sz w:val="24"/>
                 <w:szCs w:val="24"/>
               </w:rPr>
-              <w:t xml:space="preserve">6 &gt; 2 or 1 &gt; 5</w:t>
+              <w:t xml:space="preserve">3 &gt; 9 or 10 &gt; 1</w:t>
             </w:r>
           </w:p>
         </w:tc>
@@ -5191,7 +5191,7 @@
                 <w:sz w:val="24"/>
                 <w:szCs w:val="24"/>
               </w:rPr>
-              <w:t xml:space="preserve">14 != 14</w:t>
+              <w:t xml:space="preserve">8 != 8</w:t>
             </w:r>
           </w:p>
         </w:tc>
@@ -5364,7 +5364,7 @@
                 <w:sz w:val="23"/>
                 <w:szCs w:val="23"/>
               </w:rPr>
-              <w:t xml:space="preserve">x = 25</w:t>
+              <w:t xml:space="preserve">y = 30</w:t>
             </w:r>
           </w:p>
           <w:p>
@@ -5378,7 +5378,7 @@
                 <w:sz w:val="23"/>
                 <w:szCs w:val="23"/>
               </w:rPr>
-              <w:t xml:space="preserve">x -= 7</w:t>
+              <w:t xml:space="preserve">y -= 12</w:t>
             </w:r>
           </w:p>
           <w:p>
@@ -5392,7 +5392,7 @@
                 <w:sz w:val="23"/>
                 <w:szCs w:val="23"/>
               </w:rPr>
-              <w:t xml:space="preserve">x *= 2</w:t>
+              <w:t xml:space="preserve">y *= 3</w:t>
             </w:r>
           </w:p>
           <w:p>
@@ -5406,7 +5406,7 @@
                 <w:sz w:val="23"/>
                 <w:szCs w:val="23"/>
               </w:rPr>
-              <w:t xml:space="preserve">print(x)</w:t>
+              <w:t xml:space="preserve">print(y)</w:t>
             </w:r>
           </w:p>
           <w:p>
@@ -5434,7 +5434,7 @@
                 <w:sz w:val="23"/>
                 <w:szCs w:val="23"/>
               </w:rPr>
-              <w:t xml:space="preserve">Determine the final value of x and explain the order of operations.</w:t>
+              <w:t xml:space="preserve">Determine the final value of y and explain the order of operations.</w:t>
             </w:r>
           </w:p>
           <w:p>
@@ -5594,7 +5594,7 @@
                 <w:sz w:val="23"/>
                 <w:szCs w:val="23"/>
               </w:rPr>
-              <w:t xml:space="preserve">Using Python's floor division and modulo operators, find both the quotient and the remainder when 137 is divided by 12.</w:t>
+              <w:t xml:space="preserve">Using Python's floor division and modulo operators, find both the quotient and the remainder when 205 is divided by 9.</w:t>
             </w:r>
           </w:p>
           <w:p>
@@ -5754,7 +5754,7 @@
                 <w:sz w:val="23"/>
                 <w:szCs w:val="23"/>
               </w:rPr>
-              <w:t xml:space="preserve">y = 10</w:t>
+              <w:t xml:space="preserve">z = 8</w:t>
             </w:r>
           </w:p>
           <w:p>
@@ -5768,7 +5768,7 @@
                 <w:sz w:val="23"/>
                 <w:szCs w:val="23"/>
               </w:rPr>
-              <w:t xml:space="preserve">y += 5</w:t>
+              <w:t xml:space="preserve">z += 6</w:t>
             </w:r>
           </w:p>
           <w:p>
@@ -5782,7 +5782,7 @@
                 <w:sz w:val="23"/>
                 <w:szCs w:val="23"/>
               </w:rPr>
-              <w:t xml:space="preserve">y //= 3</w:t>
+              <w:t xml:space="preserve">z //= 2</w:t>
             </w:r>
           </w:p>
           <w:p>
@@ -5796,7 +5796,7 @@
                 <w:sz w:val="23"/>
                 <w:szCs w:val="23"/>
               </w:rPr>
-              <w:t xml:space="preserve">print(y)</w:t>
+              <w:t xml:space="preserve">print(z)</w:t>
             </w:r>
           </w:p>
           <w:p>
@@ -5824,7 +5824,7 @@
                 <w:sz w:val="23"/>
                 <w:szCs w:val="23"/>
               </w:rPr>
-              <w:t xml:space="preserve">Determine the final value of y and explain the order of operations.</w:t>
+              <w:t xml:space="preserve">Determine the final value of z and explain the order of operations.</w:t>
             </w:r>
           </w:p>
           <w:p>
@@ -5984,7 +5984,7 @@
                 <w:sz w:val="23"/>
                 <w:szCs w:val="23"/>
               </w:rPr>
-              <w:t xml:space="preserve">2 + 3 ** 2 * 2</w:t>
+              <w:t xml:space="preserve">5 + 2 ** 3 * 2</w:t>
             </w:r>
           </w:p>
           <w:p>
@@ -6174,7 +6174,7 @@
                 <w:sz w:val="20"/>
                 <w:szCs w:val="20"/>
               </w:rPr>
-              <w:t xml:space="preserve">name = "Miguel"</w:t>
+              <w:t xml:space="preserve">name = "Carla"</w:t>
             </w:r>
           </w:p>
           <w:p>
@@ -6188,7 +6188,7 @@
                 <w:sz w:val="20"/>
                 <w:szCs w:val="20"/>
               </w:rPr>
-              <w:t xml:space="preserve">section = "1CPE-B"</w:t>
+              <w:t xml:space="preserve">course = "1CPE-C"</w:t>
             </w:r>
           </w:p>
           <w:p>
@@ -6216,7 +6216,7 @@
                 <w:sz w:val="20"/>
                 <w:szCs w:val="20"/>
               </w:rPr>
-              <w:t xml:space="preserve">print(section)</w:t>
+              <w:t xml:space="preserve">print(course)</w:t>
             </w:r>
           </w:p>
           <w:p>
@@ -6360,7 +6360,7 @@
                 <w:sz w:val="20"/>
                 <w:szCs w:val="20"/>
               </w:rPr>
-              <w:t xml:space="preserve">a = 9</w:t>
+              <w:t xml:space="preserve">a = 14</w:t>
             </w:r>
           </w:p>
           <w:p>
@@ -6374,7 +6374,7 @@
                 <w:sz w:val="20"/>
                 <w:szCs w:val="20"/>
               </w:rPr>
-              <w:t xml:space="preserve">b = 6</w:t>
+              <w:t xml:space="preserve">b = 5</w:t>
             </w:r>
           </w:p>
           <w:p>
@@ -6546,7 +6546,7 @@
                 <w:sz w:val="20"/>
                 <w:szCs w:val="20"/>
               </w:rPr>
-              <w:t xml:space="preserve">price = 48.75</w:t>
+              <w:t xml:space="preserve">price = 62.25</w:t>
             </w:r>
           </w:p>
           <w:p>
@@ -6560,7 +6560,7 @@
                 <w:sz w:val="20"/>
                 <w:szCs w:val="20"/>
               </w:rPr>
-              <w:t xml:space="preserve">qty = 2</w:t>
+              <w:t xml:space="preserve">qty = 3</w:t>
             </w:r>
           </w:p>
           <w:p>
@@ -6716,7 +6716,7 @@
                 <w:sz w:val="20"/>
                 <w:szCs w:val="20"/>
               </w:rPr>
-              <w:t xml:space="preserve">value = "20"</w:t>
+              <w:t xml:space="preserve">value = "35"</w:t>
             </w:r>
           </w:p>
           <w:p>
@@ -6730,7 +6730,7 @@
                 <w:sz w:val="20"/>
                 <w:szCs w:val="20"/>
               </w:rPr>
-              <w:t xml:space="preserve">result = int(value) + 15</w:t>
+              <w:t xml:space="preserve">result = int(value) + 10</w:t>
             </w:r>
           </w:p>
           <w:p>
@@ -6872,7 +6872,7 @@
                 <w:sz w:val="20"/>
                 <w:szCs w:val="20"/>
               </w:rPr>
-              <w:t xml:space="preserve">a = 53</w:t>
+              <w:t xml:space="preserve">a = 88</w:t>
             </w:r>
           </w:p>
           <w:p>
@@ -6886,7 +6886,7 @@
                 <w:sz w:val="20"/>
                 <w:szCs w:val="20"/>
               </w:rPr>
-              <w:t xml:space="preserve">b = 6</w:t>
+              <w:t xml:space="preserve">b = 7</w:t>
             </w:r>
           </w:p>
           <w:p>
@@ -7058,7 +7058,7 @@
                 <w:sz w:val="20"/>
                 <w:szCs w:val="20"/>
               </w:rPr>
-              <w:t xml:space="preserve">stock = 12</w:t>
+              <w:t xml:space="preserve">temp = 30</w:t>
             </w:r>
           </w:p>
           <w:p>
@@ -7072,7 +7072,7 @@
                 <w:sz w:val="20"/>
                 <w:szCs w:val="20"/>
               </w:rPr>
-              <w:t xml:space="preserve">reorder_point = 15</w:t>
+              <w:t xml:space="preserve">is_hot = temp &gt; 28</w:t>
             </w:r>
           </w:p>
           <w:p>
@@ -7086,21 +7086,7 @@
                 <w:sz w:val="20"/>
                 <w:szCs w:val="20"/>
               </w:rPr>
-              <w:t xml:space="preserve">needs_reorder = stock &lt; reorder_point</w:t>
-            </w:r>
-          </w:p>
-          <w:p>
-            <w:pPr>
-              <w:shd w:fill="F5F5F5" w:val="clear"/>
-              <w:spacing w:after="20" w:before="0"/>
-            </w:pPr>
-            <w:r>
-              <w:rPr>
-                <w:rFonts w:ascii="Consolas" w:cs="Consolas" w:eastAsia="Consolas" w:hAnsi="Consolas"/>
-                <w:sz w:val="20"/>
-                <w:szCs w:val="20"/>
-              </w:rPr>
-              <w:t xml:space="preserve">print(needs_reorder)</w:t>
+              <w:t xml:space="preserve">print(is_hot)</w:t>
             </w:r>
           </w:p>
           <w:p>
@@ -7228,7 +7214,7 @@
                 <w:sz w:val="20"/>
                 <w:szCs w:val="20"/>
               </w:rPr>
-              <w:t xml:space="preserve">has_id = True</w:t>
+              <w:t xml:space="preserve">has_mask = True</w:t>
             </w:r>
           </w:p>
           <w:p>
@@ -7242,7 +7228,7 @@
                 <w:sz w:val="20"/>
                 <w:szCs w:val="20"/>
               </w:rPr>
-              <w:t xml:space="preserve">has_uniform = True</w:t>
+              <w:t xml:space="preserve">has_pass = False</w:t>
             </w:r>
           </w:p>
           <w:p>
@@ -7256,7 +7242,7 @@
                 <w:sz w:val="20"/>
                 <w:szCs w:val="20"/>
               </w:rPr>
-              <w:t xml:space="preserve">can_enter = has_id and has_uniform</w:t>
+              <w:t xml:space="preserve">can_enter = has_mask and has_pass</w:t>
             </w:r>
           </w:p>
           <w:p>
@@ -7398,7 +7384,7 @@
                 <w:sz w:val="20"/>
                 <w:szCs w:val="20"/>
               </w:rPr>
-              <w:t xml:space="preserve">balance = 500</w:t>
+              <w:t xml:space="preserve">points = 200</w:t>
             </w:r>
           </w:p>
           <w:p>
@@ -7412,7 +7398,7 @@
                 <w:sz w:val="20"/>
                 <w:szCs w:val="20"/>
               </w:rPr>
-              <w:t xml:space="preserve">balance -= 125</w:t>
+              <w:t xml:space="preserve">points += 50</w:t>
             </w:r>
           </w:p>
           <w:p>
@@ -7426,7 +7412,7 @@
                 <w:sz w:val="20"/>
                 <w:szCs w:val="20"/>
               </w:rPr>
-              <w:t xml:space="preserve">print(balance)</w:t>
+              <w:t xml:space="preserve">print(points)</w:t>
             </w:r>
           </w:p>
           <w:p>
@@ -7554,7 +7540,7 @@
                 <w:sz w:val="20"/>
                 <w:szCs w:val="20"/>
               </w:rPr>
-              <w:t xml:space="preserve">x = 3</w:t>
+              <w:t xml:space="preserve">x = 5</w:t>
             </w:r>
           </w:p>
           <w:p>
@@ -7568,7 +7554,7 @@
                 <w:sz w:val="20"/>
                 <w:szCs w:val="20"/>
               </w:rPr>
-              <w:t xml:space="preserve">y = 4</w:t>
+              <w:t xml:space="preserve">y = 2</w:t>
             </w:r>
           </w:p>
           <w:p>
@@ -7582,7 +7568,7 @@
                 <w:sz w:val="20"/>
                 <w:szCs w:val="20"/>
               </w:rPr>
-              <w:t xml:space="preserve">z = 2</w:t>
+              <w:t xml:space="preserve">z = 3</w:t>
             </w:r>
           </w:p>
           <w:p>
@@ -7624,7 +7610,7 @@
                 <w:sz w:val="20"/>
                 <w:szCs w:val="20"/>
               </w:rPr>
-              <w:t xml:space="preserve">print(result - 1)</w:t>
+              <w:t xml:space="preserve">print(result + 2)</w:t>
             </w:r>
           </w:p>
           <w:p>
@@ -7768,7 +7754,7 @@
                 <w:sz w:val="20"/>
                 <w:szCs w:val="20"/>
               </w:rPr>
-              <w:t xml:space="preserve">rate = 8.25</w:t>
+              <w:t xml:space="preserve">rate = 12.5</w:t>
             </w:r>
           </w:p>
           <w:p>
@@ -7782,7 +7768,7 @@
                 <w:sz w:val="20"/>
                 <w:szCs w:val="20"/>
               </w:rPr>
-              <w:t xml:space="preserve">hours = 6</w:t>
+              <w:t xml:space="preserve">units = 8</w:t>
             </w:r>
           </w:p>
           <w:p>
@@ -7796,7 +7782,7 @@
                 <w:sz w:val="20"/>
                 <w:szCs w:val="20"/>
               </w:rPr>
-              <w:t xml:space="preserve">pay = rate * hours</w:t>
+              <w:t xml:space="preserve">cost = rate * units</w:t>
             </w:r>
           </w:p>
           <w:p>
@@ -7810,7 +7796,7 @@
                 <w:sz w:val="20"/>
                 <w:szCs w:val="20"/>
               </w:rPr>
-              <w:t xml:space="preserve">is_overtime = hours &gt; 8</w:t>
+              <w:t xml:space="preserve">is_bulk = units &gt;= 10</w:t>
             </w:r>
           </w:p>
           <w:p>
@@ -7824,7 +7810,7 @@
                 <w:sz w:val="20"/>
                 <w:szCs w:val="20"/>
               </w:rPr>
-              <w:t xml:space="preserve">print(f"Pay: ₱{pay:.2f}")</w:t>
+              <w:t xml:space="preserve">print(f"Cost: ₱{cost:.2f}")</w:t>
             </w:r>
           </w:p>
           <w:p>
@@ -7838,7 +7824,7 @@
                 <w:sz w:val="20"/>
                 <w:szCs w:val="20"/>
               </w:rPr>
-              <w:t xml:space="preserve">print(is_overtime)</w:t>
+              <w:t xml:space="preserve">print(is_bulk)</w:t>
             </w:r>
           </w:p>
           <w:p>
@@ -8012,7 +7998,7 @@
                 <w:sz w:val="20"/>
                 <w:szCs w:val="20"/>
               </w:rPr>
-              <w:t xml:space="preserve">total-score = 82</w:t>
+              <w:t xml:space="preserve">unit-cost = 45</w:t>
             </w:r>
           </w:p>
           <w:p>
@@ -8026,7 +8012,7 @@
                 <w:sz w:val="20"/>
                 <w:szCs w:val="20"/>
               </w:rPr>
-              <w:t xml:space="preserve">print(total-score)</w:t>
+              <w:t xml:space="preserve">print(unit-cost)</w:t>
             </w:r>
           </w:p>
           <w:p>
@@ -8218,7 +8204,7 @@
                 <w:sz w:val="20"/>
                 <w:szCs w:val="20"/>
               </w:rPr>
-              <w:t xml:space="preserve">Print("Hello, Class!")</w:t>
+              <w:t xml:space="preserve">Print("Good morning!")</w:t>
             </w:r>
           </w:p>
           <w:p>
@@ -8410,7 +8396,7 @@
                 <w:sz w:val="20"/>
                 <w:szCs w:val="20"/>
               </w:rPr>
-              <w:t xml:space="preserve">greeting = Welcome to CPP102</w:t>
+              <w:t xml:space="preserve">course = Bachelor of Science</w:t>
             </w:r>
           </w:p>
           <w:p>
@@ -8424,7 +8410,7 @@
                 <w:sz w:val="20"/>
                 <w:szCs w:val="20"/>
               </w:rPr>
-              <w:t xml:space="preserve">print(greeting)</w:t>
+              <w:t xml:space="preserve">print(course)</w:t>
             </w:r>
           </w:p>
           <w:p>
@@ -8616,7 +8602,7 @@
                 <w:sz w:val="20"/>
                 <w:szCs w:val="20"/>
               </w:rPr>
-              <w:t xml:space="preserve">label = "Total: "</w:t>
+              <w:t xml:space="preserve">header = "Score: "</w:t>
             </w:r>
           </w:p>
           <w:p>
@@ -8630,7 +8616,7 @@
                 <w:sz w:val="20"/>
                 <w:szCs w:val="20"/>
               </w:rPr>
-              <w:t xml:space="preserve">amount = 150</w:t>
+              <w:t xml:space="preserve">value = 95</w:t>
             </w:r>
           </w:p>
           <w:p>
@@ -8644,7 +8630,7 @@
                 <w:sz w:val="20"/>
                 <w:szCs w:val="20"/>
               </w:rPr>
-              <w:t xml:space="preserve">print(label + amount)</w:t>
+              <w:t xml:space="preserve">print(header + value)</w:t>
             </w:r>
           </w:p>
           <w:p>
@@ -8836,7 +8822,7 @@
                 <w:sz w:val="20"/>
                 <w:szCs w:val="20"/>
               </w:rPr>
-              <w:t xml:space="preserve">length = 8</w:t>
+              <w:t xml:space="preserve">length = 10</w:t>
             </w:r>
           </w:p>
           <w:p>
@@ -8850,7 +8836,7 @@
                 <w:sz w:val="20"/>
                 <w:szCs w:val="20"/>
               </w:rPr>
-              <w:t xml:space="preserve">width = 5</w:t>
+              <w:t xml:space="preserve">width = 6</w:t>
             </w:r>
           </w:p>
           <w:p>
@@ -8864,7 +8850,7 @@
                 <w:sz w:val="20"/>
                 <w:szCs w:val="20"/>
               </w:rPr>
-              <w:t xml:space="preserve">perimeter = length + width</w:t>
+              <w:t xml:space="preserve">area = length + width</w:t>
             </w:r>
           </w:p>
           <w:p>
@@ -8878,7 +8864,7 @@
                 <w:sz w:val="20"/>
                 <w:szCs w:val="20"/>
               </w:rPr>
-              <w:t xml:space="preserve">print(f"Perimeter: {perimeter}")</w:t>
+              <w:t xml:space="preserve">print(f"Area: {area}")</w:t>
             </w:r>
           </w:p>
           <w:p>
@@ -9070,7 +9056,7 @@
                 <w:sz w:val="20"/>
                 <w:szCs w:val="20"/>
               </w:rPr>
-              <w:t xml:space="preserve">pricee = 45.00</w:t>
+              <w:t xml:space="preserve">raet = 8.5</w:t>
             </w:r>
           </w:p>
           <w:p>
@@ -9084,7 +9070,7 @@
                 <w:sz w:val="20"/>
                 <w:szCs w:val="20"/>
               </w:rPr>
-              <w:t xml:space="preserve">quantity = 3</w:t>
+              <w:t xml:space="preserve">hours = 4</w:t>
             </w:r>
           </w:p>
           <w:p>
@@ -9098,7 +9084,7 @@
                 <w:sz w:val="20"/>
                 <w:szCs w:val="20"/>
               </w:rPr>
-              <w:t xml:space="preserve">total = price * quantity</w:t>
+              <w:t xml:space="preserve">pay = hours * rate</w:t>
             </w:r>
           </w:p>
           <w:p>
@@ -9112,7 +9098,7 @@
                 <w:sz w:val="20"/>
                 <w:szCs w:val="20"/>
               </w:rPr>
-              <w:t xml:space="preserve">print(total)</w:t>
+              <w:t xml:space="preserve">print(pay)</w:t>
             </w:r>
           </w:p>
           <w:p>
@@ -9304,7 +9290,7 @@
                 <w:sz w:val="20"/>
                 <w:szCs w:val="20"/>
               </w:rPr>
-              <w:t xml:space="preserve">False = 10</w:t>
+              <w:t xml:space="preserve">None = 5</w:t>
             </w:r>
           </w:p>
           <w:p>
@@ -9318,7 +9304,7 @@
                 <w:sz w:val="20"/>
                 <w:szCs w:val="20"/>
               </w:rPr>
-              <w:t xml:space="preserve">print(False)</w:t>
+              <w:t xml:space="preserve">print(None)</w:t>
             </w:r>
           </w:p>
           <w:p>
@@ -9510,7 +9496,7 @@
                 <w:sz w:val="20"/>
                 <w:szCs w:val="20"/>
               </w:rPr>
-              <w:t xml:space="preserve">hours = input("Enter hours worked: ")</w:t>
+              <w:t xml:space="preserve">quantity = input("Enter quantity: ")</w:t>
             </w:r>
           </w:p>
           <w:p>
@@ -9524,7 +9510,7 @@
                 <w:sz w:val="20"/>
                 <w:szCs w:val="20"/>
               </w:rPr>
-              <w:t xml:space="preserve">rate = 55.0</w:t>
+              <w:t xml:space="preserve">price = 95.0</w:t>
             </w:r>
           </w:p>
           <w:p>
@@ -9538,7 +9524,7 @@
                 <w:sz w:val="20"/>
                 <w:szCs w:val="20"/>
               </w:rPr>
-              <w:t xml:space="preserve">pay = hours * rate</w:t>
+              <w:t xml:space="preserve">total = quantity * price</w:t>
             </w:r>
           </w:p>
           <w:p>
@@ -9552,7 +9538,7 @@
                 <w:sz w:val="20"/>
                 <w:szCs w:val="20"/>
               </w:rPr>
-              <w:t xml:space="preserve">print(pay)</w:t>
+              <w:t xml:space="preserve">print(total)</w:t>
             </w:r>
           </w:p>
           <w:p>
@@ -9786,7 +9772,7 @@
                 <w:sz w:val="20"/>
                 <w:szCs w:val="20"/>
               </w:rPr>
-              <w:t xml:space="preserve">item_qty = ______(input("Enter quantity: "))          # Blank 1</w:t>
+              <w:t xml:space="preserve">qty = ______(input("Enter quantity: "))               # Blank 1</w:t>
             </w:r>
           </w:p>
           <w:p>
@@ -9800,7 +9786,7 @@
                 <w:sz w:val="20"/>
                 <w:szCs w:val="20"/>
               </w:rPr>
-              <w:t xml:space="preserve">item_price = ______(input("Enter unit price: "))      # Blank 2</w:t>
+              <w:t xml:space="preserve">unit_price = ______(input("Enter unit price: "))      # Blank 2</w:t>
             </w:r>
           </w:p>
           <w:p>
@@ -9814,7 +9800,7 @@
                 <w:sz w:val="20"/>
                 <w:szCs w:val="20"/>
               </w:rPr>
-              <w:t xml:space="preserve">total = item_qty ______ item_price                     # Blank 3</w:t>
+              <w:t xml:space="preserve">total = qty ______ unit_price                          # Blank 3</w:t>
             </w:r>
           </w:p>
           <w:p>
@@ -9935,7 +9921,7 @@
         <w:rPr>
           <w:rFonts w:ascii="Arial" w:cs="Arial" w:eastAsia="Arial" w:hAnsi="Arial"/>
         </w:rPr>
-        <w:t xml:space="preserve">Student's Average Score</w:t>
+        <w:t xml:space="preserve">Average of Three Test Scores</w:t>
       </w:r>
     </w:p>
     <w:tbl>
@@ -9984,7 +9970,7 @@
                 <w:sz w:val="20"/>
                 <w:szCs w:val="20"/>
               </w:rPr>
-              <w:t xml:space="preserve">q1 = float(input("Enter first quiz score: "))</w:t>
+              <w:t xml:space="preserve">score1 = float(input("Enter first score: "))</w:t>
             </w:r>
           </w:p>
           <w:p>
@@ -9998,7 +9984,7 @@
                 <w:sz w:val="20"/>
                 <w:szCs w:val="20"/>
               </w:rPr>
-              <w:t xml:space="preserve">q2 = float(input("Enter second quiz score: "))</w:t>
+              <w:t xml:space="preserve">score2 = float(input("Enter second score: "))</w:t>
             </w:r>
           </w:p>
           <w:p>
@@ -10012,7 +9998,7 @@
                 <w:sz w:val="20"/>
                 <w:szCs w:val="20"/>
               </w:rPr>
-              <w:t xml:space="preserve">q3 = float(input("Enter third quiz score: "))</w:t>
+              <w:t xml:space="preserve">score3 = float(input("Enter third score: "))</w:t>
             </w:r>
           </w:p>
           <w:p>
@@ -10026,7 +10012,7 @@
                 <w:sz w:val="20"/>
                 <w:szCs w:val="20"/>
               </w:rPr>
-              <w:t xml:space="preserve">average = (q1 + q2 + q3) ______ 3                     # Blank 1</w:t>
+              <w:t xml:space="preserve">average = (score1 + score2 + score3) ______ 3          # Blank 1</w:t>
             </w:r>
           </w:p>
           <w:p>
@@ -11351,7 +11337,7 @@
         <w:rPr>
           <w:rFonts w:ascii="Arial" w:cs="Arial" w:eastAsia="Arial" w:hAnsi="Arial"/>
         </w:rPr>
-        <w:t xml:space="preserve">School Supply Purchase</w:t>
+        <w:t xml:space="preserve">Art Supplies Purchase</w:t>
       </w:r>
     </w:p>
     <w:p>
@@ -11369,7 +11355,7 @@
           <w:sz w:val="24"/>
           <w:szCs w:val="24"/>
         </w:rPr>
-        <w:t xml:space="preserve">A student is buying supplies for the new school term at a bookstore. The program must ask for the number of reams of bond paper and the price per ream, the number of ballpens and the price per ballpen, and the number of folders and the price per folder. It must then compute and display the total purchase amount.</w:t>
+        <w:t xml:space="preserve">A student is buying materials for an art class project. The program must ask for the number of canvas boards and the price per board, the number of paintbrushes and the price per paintbrush, and the number of paint tubes and the price per tube. It must then compute and display the total purchase amount.</w:t>
       </w:r>
     </w:p>
     <w:p>
@@ -11394,7 +11380,7 @@
           <w:sz w:val="23"/>
           <w:szCs w:val="23"/>
         </w:rPr>
-        <w:t xml:space="preserve">Reams of bond paper: 2;  Price per ream: ₱210.00;  Ballpens: 5 pieces;  Price per ballpen: ₱15.00;  Folders: 10 pieces;  Price per folder: ₱8.50</w:t>
+        <w:t xml:space="preserve">Canvas boards: 3;  Price per board: ₱150.00;  Paintbrushes: 6;  Price per paintbrush: ₱35.00;  Paint tubes: 8;  Price per tube: ₱45.00</w:t>
       </w:r>
     </w:p>
     <w:p>
@@ -12750,7 +12736,7 @@
         <w:rPr>
           <w:rFonts w:ascii="Arial" w:cs="Arial" w:eastAsia="Arial" w:hAnsi="Arial"/>
         </w:rPr>
-        <w:t xml:space="preserve">Average of Three Quiz Scores</w:t>
+        <w:t xml:space="preserve">Average of Three Long Test Scores</w:t>
       </w:r>
     </w:p>
     <w:p>
@@ -12768,7 +12754,7 @@
           <w:sz w:val="24"/>
           <w:szCs w:val="24"/>
         </w:rPr>
-        <w:t xml:space="preserve">A teacher wants a program that computes a student's average score in three quizzes. The program must ask for each of the three quiz scores and display the average.</w:t>
+        <w:t xml:space="preserve">A teacher wants a program that computes a student's average score in three long tests. The program must ask for each of the three scores and display the average.</w:t>
       </w:r>
     </w:p>
     <w:p>
@@ -12793,7 +12779,7 @@
           <w:sz w:val="23"/>
           <w:szCs w:val="23"/>
         </w:rPr>
-        <w:t xml:space="preserve">Quiz 1: 90;  Quiz 2: 84;  Quiz 3: 95</w:t>
+        <w:t xml:space="preserve">Test 1: 82;  Test 2: 77;  Test 3: 90</w:t>
       </w:r>
     </w:p>
     <w:p>
@@ -14167,7 +14153,7 @@
           <w:sz w:val="24"/>
           <w:szCs w:val="24"/>
         </w:rPr>
-        <w:t xml:space="preserve">A weather-monitoring program must convert a temperature reading from degrees Celsius to degrees Fahrenheit.</w:t>
+        <w:t xml:space="preserve">A weather-monitoring kiosk must convert a temperature reading from degrees Celsius to degrees Fahrenheit for display.</w:t>
       </w:r>
     </w:p>
     <w:p>
@@ -14192,7 +14178,7 @@
           <w:sz w:val="23"/>
           <w:szCs w:val="23"/>
         </w:rPr>
-        <w:t xml:space="preserve">Temperature: 24°C</w:t>
+        <w:t xml:space="preserve">Temperature: 15°C</w:t>
       </w:r>
     </w:p>
     <w:p>
@@ -15548,7 +15534,7 @@
         <w:rPr>
           <w:rFonts w:ascii="Arial" w:cs="Arial" w:eastAsia="Arial" w:hAnsi="Arial"/>
         </w:rPr>
-        <w:t xml:space="preserve">Area and Perimeter of a Rectangular Garden</w:t>
+        <w:t xml:space="preserve">Area and Perimeter of a Classroom Floor</w:t>
       </w:r>
     </w:p>
     <w:p>
@@ -15566,7 +15552,7 @@
           <w:sz w:val="24"/>
           <w:szCs w:val="24"/>
         </w:rPr>
-        <w:t xml:space="preserve">A homeowner is planning a rectangular garden and needs a program that computes both its area and perimeter, given the garden's length and width.</w:t>
+        <w:t xml:space="preserve">A facilities officer needs a program that computes both the area and the perimeter of a rectangular classroom floor, given its length and width, to plan for tile and molding purchases.</w:t>
       </w:r>
     </w:p>
     <w:p>
@@ -15591,7 +15577,7 @@
           <w:sz w:val="23"/>
           <w:szCs w:val="23"/>
         </w:rPr>
-        <w:t xml:space="preserve">Length: 9.5 meters;  Width: 6.2 meters</w:t>
+        <w:t xml:space="preserve">Length: 10.8 meters;  Width: 7.4 meters</w:t>
       </w:r>
     </w:p>
     <w:p>
@@ -16947,7 +16933,7 @@
         <w:rPr>
           <w:rFonts w:ascii="Arial" w:cs="Arial" w:eastAsia="Arial" w:hAnsi="Arial"/>
         </w:rPr>
-        <w:t xml:space="preserve">Gross Salary Based on Hours Worked</w:t>
+        <w:t xml:space="preserve">Tutor's Salary Based on Hours Worked</w:t>
       </w:r>
     </w:p>
     <w:p>
@@ -16965,7 +16951,7 @@
           <w:sz w:val="24"/>
           <w:szCs w:val="24"/>
         </w:rPr>
-        <w:t xml:space="preserve">A part-time employee is paid based on the number of hours worked in a week. The program must ask for the number of hours worked and the hourly rate, then compute the gross pay.</w:t>
+        <w:t xml:space="preserve">A part-time tutor is paid based on the number of hours tutored in a week. The program must ask for the number of hours tutored and the hourly rate, then compute the gross pay.</w:t>
       </w:r>
     </w:p>
     <w:p>
@@ -16990,7 +16976,7 @@
           <w:sz w:val="23"/>
           <w:szCs w:val="23"/>
         </w:rPr>
-        <w:t xml:space="preserve">Hours worked: 40;  Hourly rate: ₱95.00</w:t>
+        <w:t xml:space="preserve">Hours tutored: 15;  Hourly rate: ₱120.00</w:t>
       </w:r>
     </w:p>
     <w:p>
@@ -18346,7 +18332,7 @@
         <w:rPr>
           <w:rFonts w:ascii="Arial" w:cs="Arial" w:eastAsia="Arial" w:hAnsi="Arial"/>
         </w:rPr>
-        <w:t xml:space="preserve">Change from an Amount Paid</w:t>
+        <w:t xml:space="preserve">Change from an Amount Paid at the Canteen</w:t>
       </w:r>
     </w:p>
     <w:p>
@@ -18364,7 +18350,7 @@
           <w:sz w:val="24"/>
           <w:szCs w:val="24"/>
         </w:rPr>
-        <w:t xml:space="preserve">A sari-sari store owner needs a program that computes the change to give a customer, given the price of an item and the amount the customer paid.</w:t>
+        <w:t xml:space="preserve">A school canteen cashier needs a program that computes the change to give a student, given the price of a meal and the amount the student paid.</w:t>
       </w:r>
     </w:p>
     <w:p>
@@ -18389,7 +18375,7 @@
           <w:sz w:val="23"/>
           <w:szCs w:val="23"/>
         </w:rPr>
-        <w:t xml:space="preserve">Price: ₱458.75;  Amount paid: ₱500.00</w:t>
+        <w:t xml:space="preserve">Price: ₱87.50;  Amount paid: ₱100.00</w:t>
       </w:r>
     </w:p>
     <w:p>
@@ -19745,7 +19731,7 @@
         <w:rPr>
           <w:rFonts w:ascii="Arial" w:cs="Arial" w:eastAsia="Arial" w:hAnsi="Arial"/>
         </w:rPr>
-        <w:t xml:space="preserve">Remaining Student Allowance</w:t>
+        <w:t xml:space="preserve">Remaining Daily Allowance</w:t>
       </w:r>
     </w:p>
     <w:p>
@@ -19763,7 +19749,7 @@
           <w:sz w:val="24"/>
           <w:szCs w:val="24"/>
         </w:rPr>
-        <w:t xml:space="preserve">A student wants to track a weekly allowance. The program must ask for the weekly allowance and the amounts spent on transportation fare, food, and mobile load, then compute the amount remaining.</w:t>
+        <w:t xml:space="preserve">A student wants to track a daily allowance. The program must ask for the daily allowance and the amounts spent on jeepney fare, snacks, and printing, then compute the amount remaining.</w:t>
       </w:r>
     </w:p>
     <w:p>
@@ -19788,7 +19774,7 @@
           <w:sz w:val="23"/>
           <w:szCs w:val="23"/>
         </w:rPr>
-        <w:t xml:space="preserve">Weekly allowance: ₱350.00;  Transportation fare: ₱60.00;  Food: ₱120.00;  Load: ₱50.00</w:t>
+        <w:t xml:space="preserve">Daily allowance: ₱200.00;  Jeepney fare: ₱25.00;  Snacks: ₱45.00;  Printing: ₱30.00</w:t>
       </w:r>
     </w:p>
     <w:p>
@@ -21144,7 +21130,7 @@
         <w:rPr>
           <w:rFonts w:ascii="Arial" w:cs="Arial" w:eastAsia="Arial" w:hAnsi="Arial"/>
         </w:rPr>
-        <w:t xml:space="preserve">Distance Traveled Using Speed and Time</w:t>
+        <w:t xml:space="preserve">Distance Covered While Jogging</w:t>
       </w:r>
     </w:p>
     <w:p>
@@ -21162,7 +21148,7 @@
           <w:sz w:val="24"/>
           <w:szCs w:val="24"/>
         </w:rPr>
-        <w:t xml:space="preserve">A delivery rider wants to estimate the distance covered on a trip. The program must ask for the average speed and the travel time, then compute the distance traveled.</w:t>
+        <w:t xml:space="preserve">A jogger wants to estimate the distance covered during a morning run. The program must ask for the average speed and the time spent jogging, then compute the distance covered.</w:t>
       </w:r>
     </w:p>
     <w:p>
@@ -21187,7 +21173,7 @@
           <w:sz w:val="23"/>
           <w:szCs w:val="23"/>
         </w:rPr>
-        <w:t xml:space="preserve">Speed: 80 km/h;  Time: 1.75 hours</w:t>
+        <w:t xml:space="preserve">Speed: 6.5 km/h;  Time: 1.2 hours</w:t>
       </w:r>
     </w:p>
     <w:p>
@@ -22543,7 +22529,7 @@
         <w:rPr>
           <w:rFonts w:ascii="Arial" w:cs="Arial" w:eastAsia="Arial" w:hAnsi="Arial"/>
         </w:rPr>
-        <w:t xml:space="preserve">Simple Interest on a Savings Deposit</w:t>
+        <w:t xml:space="preserve">Simple Interest on a Time Deposit</w:t>
       </w:r>
     </w:p>
     <w:p>
@@ -22561,7 +22547,7 @@
           <w:sz w:val="24"/>
           <w:szCs w:val="24"/>
         </w:rPr>
-        <w:t xml:space="preserve">A bank customer wants to know how much simple interest a deposit will earn. The program must ask for the principal amount, the annual interest rate (in decimal form), and the time in years, then compute the interest earned and the total amount after interest.</w:t>
+        <w:t xml:space="preserve">A bank customer wants to know how much simple interest a time deposit will earn. The program must ask for the principal amount, the annual interest rate (in decimal form), and the time in years, then compute the interest earned and the total amount after interest.</w:t>
       </w:r>
     </w:p>
     <w:p>
@@ -22586,7 +22572,7 @@
           <w:sz w:val="23"/>
           <w:szCs w:val="23"/>
         </w:rPr>
-        <w:t xml:space="preserve">Principal: ₱15,000.00;  Rate: 0.05 (5%);  Time: 2 years</w:t>
+        <w:t xml:space="preserve">Principal: ₱25,000.00;  Rate: 0.04 (4%);  Time: 3 years</w:t>
       </w:r>
     </w:p>
     <w:p>
@@ -23985,7 +23971,7 @@
           <w:sz w:val="23"/>
           <w:szCs w:val="23"/>
         </w:rPr>
-        <w:t xml:space="preserve">Consumption: 350 kWh;  Rate: ₱11.50 per kWh</w:t>
+        <w:t xml:space="preserve">Consumption: 280 kWh;  Rate: ₱10.75 per kWh</w:t>
       </w:r>
     </w:p>
     <w:p>
@@ -25341,7 +25327,7 @@
         <w:rPr>
           <w:rFonts w:ascii="Arial" w:cs="Arial" w:eastAsia="Arial" w:hAnsi="Arial"/>
         </w:rPr>
-        <w:t xml:space="preserve">Total Cost of Computer Components</w:t>
+        <w:t xml:space="preserve">Total Cost of Computer Peripherals</w:t>
       </w:r>
     </w:p>
     <w:p>
@@ -25359,7 +25345,7 @@
           <w:sz w:val="24"/>
           <w:szCs w:val="24"/>
         </w:rPr>
-        <w:t xml:space="preserve">A student is assembling a budget computer and needs a program that adds up the prices of four components: the CPU, RAM, SSD, and monitor.</w:t>
+        <w:t xml:space="preserve">A student is completing a home computer setup and needs a program that adds up the prices of four peripherals: the keyboard, mouse, webcam, and headset.</w:t>
       </w:r>
     </w:p>
     <w:p>
@@ -25384,7 +25370,7 @@
           <w:sz w:val="23"/>
           <w:szCs w:val="23"/>
         </w:rPr>
-        <w:t xml:space="preserve">CPU: ₱8,500.00;  RAM: ₱2,200.00;  SSD: ₱3,100.00;  Monitor: ₱6,500.00</w:t>
+        <w:t xml:space="preserve">Keyboard: ₱1,200.00;  Mouse: ₱650.00;  Webcam: ₱1,800.00;  Headset: ₱950.00</w:t>
       </w:r>
     </w:p>
     <w:p>
@@ -26758,7 +26744,7 @@
           <w:sz w:val="24"/>
           <w:szCs w:val="24"/>
         </w:rPr>
-        <w:t xml:space="preserve">A scheduling program needs to convert a duration given entirely in minutes into a more readable format of hours and remaining minutes.</w:t>
+        <w:t xml:space="preserve">A video-editing program needs to convert a clip's duration, given entirely in minutes, into a more readable format of hours and remaining minutes.</w:t>
       </w:r>
     </w:p>
     <w:p>
@@ -26783,7 +26769,7 @@
           <w:sz w:val="23"/>
           <w:szCs w:val="23"/>
         </w:rPr>
-        <w:t xml:space="preserve">Total minutes: 257</w:t>
+        <w:t xml:space="preserve">Total minutes: 319</w:t>
       </w:r>
     </w:p>
     <w:p>
@@ -28373,7 +28359,7 @@
                 <w:sz w:val="24"/>
                 <w:szCs w:val="24"/>
               </w:rPr>
-              <w:t xml:space="preserve">quiz_score</w:t>
+              <w:t xml:space="preserve">customer_name</w:t>
             </w:r>
           </w:p>
         </w:tc>
@@ -28506,7 +28492,7 @@
                 <w:sz w:val="24"/>
                 <w:szCs w:val="24"/>
               </w:rPr>
-              <w:t xml:space="preserve">3rd_attempt</w:t>
+              <w:t xml:space="preserve">1st_place</w:t>
             </w:r>
           </w:p>
         </w:tc>
@@ -28570,7 +28556,7 @@
                 <w:sz w:val="24"/>
                 <w:szCs w:val="24"/>
               </w:rPr>
-              <w:t xml:space="preserve">Begins with a digit (3). Python identifiers cannot start with a number.</w:t>
+              <w:t xml:space="preserve">Begins with a digit (1). Python identifiers cannot start with a number.</w:t>
             </w:r>
           </w:p>
         </w:tc>
@@ -28639,7 +28625,7 @@
                 <w:sz w:val="24"/>
                 <w:szCs w:val="24"/>
               </w:rPr>
-              <w:t xml:space="preserve">student-name</w:t>
+              <w:t xml:space="preserve">item#price</w:t>
             </w:r>
           </w:p>
         </w:tc>
@@ -28703,7 +28689,7 @@
                 <w:sz w:val="24"/>
                 <w:szCs w:val="24"/>
               </w:rPr>
-              <w:t xml:space="preserve">Contains a hyphen (-), which Python interprets as the subtraction operator.</w:t>
+              <w:t xml:space="preserve">Contains the special character #, which is not allowed in Python identifiers.</w:t>
             </w:r>
           </w:p>
         </w:tc>
@@ -28772,7 +28758,7 @@
                 <w:sz w:val="24"/>
                 <w:szCs w:val="24"/>
               </w:rPr>
-              <w:t xml:space="preserve">total amount</w:t>
+              <w:t xml:space="preserve">monthly income</w:t>
             </w:r>
           </w:p>
         </w:tc>
@@ -28836,7 +28822,7 @@
                 <w:sz w:val="24"/>
                 <w:szCs w:val="24"/>
               </w:rPr>
-              <w:t xml:space="preserve">Contains a space. Identifiers must be a single unbroken word (use total_amount instead).</w:t>
+              <w:t xml:space="preserve">Contains a space. Identifiers must be a single unbroken word (use monthly_income instead).</w:t>
             </w:r>
           </w:p>
         </w:tc>
@@ -28905,7 +28891,7 @@
                 <w:sz w:val="24"/>
                 <w:szCs w:val="24"/>
               </w:rPr>
-              <w:t xml:space="preserve">return</w:t>
+              <w:t xml:space="preserve">global</w:t>
             </w:r>
           </w:p>
         </w:tc>
@@ -28969,7 +28955,7 @@
                 <w:sz w:val="24"/>
                 <w:szCs w:val="24"/>
               </w:rPr>
-              <w:t xml:space="preserve">"return" is a reserved Python keyword and cannot be used as a variable name.</w:t>
+              <w:t xml:space="preserve">"global" is a reserved Python keyword and cannot be used as a variable name.</w:t>
             </w:r>
           </w:p>
         </w:tc>
@@ -29002,7 +28988,7 @@
           <w:sz w:val="24"/>
           <w:szCs w:val="24"/>
         </w:rPr>
-        <w:t xml:space="preserve">Invalid because it begins with the digit 2. Corrected: quiz_2 (or second_quiz).</w:t>
+        <w:t xml:space="preserve">Invalid because the hyphen is read as subtraction (grade - level). Corrected: grade_level.</w:t>
       </w:r>
     </w:p>
     <w:p>
@@ -29020,7 +29006,7 @@
           <w:sz w:val="24"/>
           <w:szCs w:val="24"/>
         </w:rPr>
-        <w:t xml:space="preserve">Any acceptable rewrite that starts with a letter/underscore and contains no spaces or symbols is correct.</w:t>
+        <w:t xml:space="preserve">Any acceptable rewrite using an underscore or camelCase instead of a hyphen is correct.</w:t>
       </w:r>
     </w:p>
     <w:p>
@@ -29045,7 +29031,7 @@
           <w:sz w:val="24"/>
           <w:szCs w:val="24"/>
         </w:rPr>
-        <w:t xml:space="preserve">Invalid because the hyphen is read as subtraction (electric - bill). Corrected: electric_bill.</w:t>
+        <w:t xml:space="preserve">Invalid because it begins with the digit 5. Corrected: floor_5 (or fifth_floor).</w:t>
       </w:r>
     </w:p>
     <w:p>
@@ -29063,7 +29049,7 @@
           <w:sz w:val="24"/>
           <w:szCs w:val="24"/>
         </w:rPr>
-        <w:t xml:space="preserve">Any acceptable rewrite using an underscore or camelCase instead of a hyphen is correct.</w:t>
+        <w:t xml:space="preserve">Any acceptable rewrite that starts with a letter/underscore is correct.</w:t>
       </w:r>
     </w:p>
     <w:p>
@@ -29088,7 +29074,7 @@
           <w:sz w:val="24"/>
           <w:szCs w:val="24"/>
         </w:rPr>
-        <w:t xml:space="preserve">No. Python treats "Distance" and "distance" as two completely different variables because identifiers are case-sensitive.</w:t>
+        <w:t xml:space="preserve">No. Python treats "Score" and "score" as two completely different variables because identifiers are case-sensitive.</w:t>
       </w:r>
     </w:p>
     <w:p>
@@ -29106,7 +29092,7 @@
           <w:sz w:val="24"/>
           <w:szCs w:val="24"/>
         </w:rPr>
-        <w:t xml:space="preserve">Example: Distance = 120 followed by print(distance) raises a NameError, because "distance" (lowercase) was never defined — only "Distance" was.</w:t>
+        <w:t xml:space="preserve">Example: Score = 95 followed by print(score) raises a NameError, because "score" (lowercase) was never defined — only "Score" was.</w:t>
       </w:r>
     </w:p>
     <w:p>
@@ -29131,7 +29117,7 @@
           <w:sz w:val="24"/>
           <w:szCs w:val="24"/>
         </w:rPr>
-        <w:t xml:space="preserve">Sample acceptable answers: student_name, unit_price, quantity, total_amount.</w:t>
+        <w:t xml:space="preserve">Sample acceptable answers: employee_id, monthly_salary, num_dependents, net_pay.</w:t>
       </w:r>
     </w:p>
     <w:p>
@@ -29174,7 +29160,7 @@
           <w:sz w:val="24"/>
           <w:szCs w:val="24"/>
         </w:rPr>
-        <w:t xml:space="preserve">Sample identifiers: previous_reading, current_reading, kwh_consumed, total_bill. The total_bill (and possibly kwh_consumed) most likely require float, since electric bills and metered consumption are usually expressed with decimal/centavo values.</w:t>
+        <w:t xml:space="preserve">Sample identifiers: previous_reading, current_reading, cubic_meters_used, total_bill. The total_bill most likely requires float, since water bills are usually expressed with peso-and-centavo values.</w:t>
       </w:r>
     </w:p>
     <w:p>
@@ -29192,7 +29178,7 @@
           <w:sz w:val="24"/>
           <w:szCs w:val="24"/>
         </w:rPr>
-        <w:t xml:space="preserve">Meter readings could reasonably be int or float depending on the meter; the total peso amount almost always needs float for centavos.</w:t>
+        <w:t xml:space="preserve">Meter readings and cubic meters could reasonably be int; the peso total almost always needs float for centavos.</w:t>
       </w:r>
     </w:p>
     <w:p>
@@ -29511,7 +29497,7 @@
                 <w:sz w:val="20"/>
                 <w:szCs w:val="20"/>
               </w:rPr>
-              <w:t xml:space="preserve">quantity = int(input("Enter number of notebooks: "))</w:t>
+              <w:t xml:space="preserve">hours = float(input("Enter hours studied: "))</w:t>
             </w:r>
           </w:p>
           <w:p>
@@ -29524,7 +29510,7 @@
                 <w:sz w:val="20"/>
                 <w:szCs w:val="20"/>
               </w:rPr>
-              <w:t xml:space="preserve">unit_price = float(input("Enter unit price: "))</w:t>
+              <w:t xml:space="preserve">pages = int(input("Enter pages read: "))</w:t>
             </w:r>
           </w:p>
           <w:p>
@@ -29537,7 +29523,7 @@
                 <w:sz w:val="20"/>
                 <w:szCs w:val="20"/>
               </w:rPr>
-              <w:t xml:space="preserve">total = quantity * unit_price</w:t>
+              <w:t xml:space="preserve">result = hours * pages</w:t>
             </w:r>
           </w:p>
         </w:tc>
@@ -29558,7 +29544,7 @@
           <w:sz w:val="24"/>
           <w:szCs w:val="24"/>
         </w:rPr>
-        <w:t xml:space="preserve">Without converting the input() strings using int()/float(), the multiplication would raise a TypeError.</w:t>
+        <w:t xml:space="preserve">Without converting the input() strings using float()/int(), the multiplication would raise a TypeError.</w:t>
       </w:r>
     </w:p>
     <w:p>
@@ -29632,7 +29618,7 @@
                 <w:sz w:val="20"/>
                 <w:szCs w:val="20"/>
               </w:rPr>
-              <w:t xml:space="preserve">TypeError: can only concatenate str (not "int") to str. Corrected: print(name + str(age)) — or use an f-string: print(f"{name}{age}").</w:t>
+              <w:t xml:space="preserve">TypeError: can only concatenate str (not "int") to str. Corrected: print(subject + str(grade)) — or use an f-string: print(f"{subject}{grade}").</w:t>
             </w:r>
           </w:p>
         </w:tc>
@@ -29727,7 +29713,7 @@
                 <w:sz w:val="20"/>
                 <w:szCs w:val="20"/>
               </w:rPr>
-              <w:t xml:space="preserve">Since both hours and rate remain strings from input(), hours * rate attempts to repeat a string, raising: TypeError: can't multiply sequence by non-int of type 'str'.</w:t>
+              <w:t xml:space="preserve">Since both qty and price remain strings from input(), qty * price attempts to repeat a string, raising: TypeError: can't multiply sequence by non-int of type 'str'.</w:t>
             </w:r>
           </w:p>
         </w:tc>
@@ -29749,9 +29735,9 @@
           <w:szCs w:val="24"/>
         </w:rPr>
         <w:t xml:space="preserve">Correction:
-hours = float(input("Enter hours worked: "))
-rate = float(input("Enter hourly rate: "))
-pay = hours * rate</w:t>
+qty = int(input("Enter quantity: "))
+price = float(input("Enter price: "))
+total = qty * price</w:t>
       </w:r>
     </w:p>
     <w:p>
@@ -29794,7 +29780,7 @@
           <w:sz w:val="24"/>
           <w:szCs w:val="24"/>
         </w:rPr>
-        <w:t xml:space="preserve">float — regardless of whether the user types a whole number or a decimal number.</w:t>
+        <w:t xml:space="preserve">int — a whole number, with no decimal part.</w:t>
       </w:r>
     </w:p>
     <w:p>
@@ -30001,7 +29987,7 @@
                 <w:sz w:val="24"/>
                 <w:szCs w:val="24"/>
               </w:rPr>
-              <w:t xml:space="preserve">18 + 2 * 5</w:t>
+              <w:t xml:space="preserve">22 + 3 * 4</w:t>
             </w:r>
           </w:p>
         </w:tc>
@@ -30033,7 +30019,7 @@
                 <w:sz w:val="24"/>
                 <w:szCs w:val="24"/>
               </w:rPr>
-              <w:t xml:space="preserve">28</w:t>
+              <w:t xml:space="preserve">34</w:t>
             </w:r>
           </w:p>
         </w:tc>
@@ -30102,7 +30088,7 @@
                 <w:sz w:val="24"/>
                 <w:szCs w:val="24"/>
               </w:rPr>
-              <w:t xml:space="preserve">(18 + 2) * 5</w:t>
+              <w:t xml:space="preserve">(22 + 3) * 4</w:t>
             </w:r>
           </w:p>
         </w:tc>
@@ -30203,7 +30189,7 @@
                 <w:sz w:val="24"/>
                 <w:szCs w:val="24"/>
               </w:rPr>
-              <w:t xml:space="preserve">29 // 6</w:t>
+              <w:t xml:space="preserve">45 // 7</w:t>
             </w:r>
           </w:p>
         </w:tc>
@@ -30235,7 +30221,7 @@
                 <w:sz w:val="24"/>
                 <w:szCs w:val="24"/>
               </w:rPr>
-              <w:t xml:space="preserve">4</w:t>
+              <w:t xml:space="preserve">6</w:t>
             </w:r>
           </w:p>
         </w:tc>
@@ -30304,7 +30290,7 @@
                 <w:sz w:val="24"/>
                 <w:szCs w:val="24"/>
               </w:rPr>
-              <w:t xml:space="preserve">29 % 6</w:t>
+              <w:t xml:space="preserve">45 % 7</w:t>
             </w:r>
           </w:p>
         </w:tc>
@@ -30336,7 +30322,7 @@
                 <w:sz w:val="24"/>
                 <w:szCs w:val="24"/>
               </w:rPr>
-              <w:t xml:space="preserve">5</w:t>
+              <w:t xml:space="preserve">3</w:t>
             </w:r>
           </w:p>
         </w:tc>
@@ -30405,7 +30391,7 @@
                 <w:sz w:val="24"/>
                 <w:szCs w:val="24"/>
               </w:rPr>
-              <w:t xml:space="preserve">4 ** 3</w:t>
+              <w:t xml:space="preserve">5 ** 3</w:t>
             </w:r>
           </w:p>
         </w:tc>
@@ -30437,7 +30423,7 @@
                 <w:sz w:val="24"/>
                 <w:szCs w:val="24"/>
               </w:rPr>
-              <w:t xml:space="preserve">64</w:t>
+              <w:t xml:space="preserve">125</w:t>
             </w:r>
           </w:p>
         </w:tc>
@@ -30506,7 +30492,7 @@
                 <w:sz w:val="24"/>
                 <w:szCs w:val="24"/>
               </w:rPr>
-              <w:t xml:space="preserve">15 - 8 / 4</w:t>
+              <w:t xml:space="preserve">20 - 9 / 3</w:t>
             </w:r>
           </w:p>
         </w:tc>
@@ -30538,7 +30524,7 @@
                 <w:sz w:val="24"/>
                 <w:szCs w:val="24"/>
               </w:rPr>
-              <w:t xml:space="preserve">13.0</w:t>
+              <w:t xml:space="preserve">17.0</w:t>
             </w:r>
           </w:p>
         </w:tc>
@@ -30607,7 +30593,7 @@
                 <w:sz w:val="24"/>
                 <w:szCs w:val="24"/>
               </w:rPr>
-              <w:t xml:space="preserve">12 == 12 and 7 &gt; 10</w:t>
+              <w:t xml:space="preserve">15 == 15 and 4 &gt; 9</w:t>
             </w:r>
           </w:p>
         </w:tc>
@@ -30708,7 +30694,7 @@
                 <w:sz w:val="24"/>
                 <w:szCs w:val="24"/>
               </w:rPr>
-              <w:t xml:space="preserve">not (9 &lt;= 3)</w:t>
+              <w:t xml:space="preserve">not (6 &lt;= 2)</w:t>
             </w:r>
           </w:p>
         </w:tc>
@@ -30809,7 +30795,7 @@
                 <w:sz w:val="24"/>
                 <w:szCs w:val="24"/>
               </w:rPr>
-              <w:t xml:space="preserve">6 &gt; 2 or 1 &gt; 5</w:t>
+              <w:t xml:space="preserve">3 &gt; 9 or 10 &gt; 1</w:t>
             </w:r>
           </w:p>
         </w:tc>
@@ -30910,7 +30896,7 @@
                 <w:sz w:val="24"/>
                 <w:szCs w:val="24"/>
               </w:rPr>
-              <w:t xml:space="preserve">14 != 14</w:t>
+              <w:t xml:space="preserve">8 != 8</w:t>
             </w:r>
           </w:p>
         </w:tc>
@@ -30975,7 +30961,7 @@
           <w:sz w:val="24"/>
           <w:szCs w:val="24"/>
         </w:rPr>
-        <w:t xml:space="preserve">36</w:t>
+        <w:t xml:space="preserve">54</w:t>
       </w:r>
     </w:p>
     <w:p>
@@ -30993,7 +30979,7 @@
           <w:sz w:val="24"/>
           <w:szCs w:val="24"/>
         </w:rPr>
-        <w:t xml:space="preserve">x -= 7 means x = x - 7 → 25 - 7 = 18. Then x *= 2 means x = x * 2 → 18 * 2 = 36. Assignment operators apply in the order they appear, top to bottom.</w:t>
+        <w:t xml:space="preserve">y -= 12 means y = y - 12 → 30 - 12 = 18. Then y *= 3 means y = y * 3 → 18 * 3 = 54. Assignment operators apply in the order they appear, top to bottom.</w:t>
       </w:r>
     </w:p>
     <w:p>
@@ -31018,7 +31004,7 @@
           <w:sz w:val="24"/>
           <w:szCs w:val="24"/>
         </w:rPr>
-        <w:t xml:space="preserve">Quotient (137 // 12) = 11; Remainder (137 % 12) = 5.</w:t>
+        <w:t xml:space="preserve">Quotient (205 // 9) = 22; Remainder (205 % 9) = 7.</w:t>
       </w:r>
     </w:p>
     <w:p>
@@ -31043,7 +31029,7 @@
           <w:sz w:val="24"/>
           <w:szCs w:val="24"/>
         </w:rPr>
-        <w:t xml:space="preserve">5</w:t>
+        <w:t xml:space="preserve">7</w:t>
       </w:r>
     </w:p>
     <w:p>
@@ -31061,7 +31047,7 @@
           <w:sz w:val="24"/>
           <w:szCs w:val="24"/>
         </w:rPr>
-        <w:t xml:space="preserve">y += 5 → y = 10 + 5 = 15. Then y //= 3 → y = 15 // 3 = 5.</w:t>
+        <w:t xml:space="preserve">z += 6 → z = 8 + 6 = 14. Then z //= 2 → z = 14 // 2 = 7.</w:t>
       </w:r>
     </w:p>
     <w:p>
@@ -31086,7 +31072,7 @@
           <w:sz w:val="24"/>
           <w:szCs w:val="24"/>
         </w:rPr>
-        <w:t xml:space="preserve">20</w:t>
+        <w:t xml:space="preserve">21</w:t>
       </w:r>
     </w:p>
     <w:p>
@@ -31104,7 +31090,7 @@
           <w:sz w:val="24"/>
           <w:szCs w:val="24"/>
         </w:rPr>
-        <w:t xml:space="preserve">Exponentiation is evaluated first (3 ** 2 = 9), then multiplication (9 * 2 = 18), then addition (2 + 18 = 20).</w:t>
+        <w:t xml:space="preserve">Exponentiation is evaluated first (2 ** 3 = 8), then multiplication (8 * 2 = 16), then addition (5 + 16 = 21).</w:t>
       </w:r>
     </w:p>
     <w:p>
@@ -31190,7 +31176,7 @@
                 <w:sz w:val="20"/>
                 <w:szCs w:val="20"/>
               </w:rPr>
-              <w:t xml:space="preserve">Miguel</w:t>
+              <w:t xml:space="preserve">Carla</w:t>
             </w:r>
           </w:p>
           <w:p>
@@ -31203,7 +31189,7 @@
                 <w:sz w:val="20"/>
                 <w:szCs w:val="20"/>
               </w:rPr>
-              <w:t xml:space="preserve">1CPE-B</w:t>
+              <w:t xml:space="preserve">1CPE-C</w:t>
             </w:r>
           </w:p>
         </w:tc>
@@ -31280,7 +31266,7 @@
                 <w:sz w:val="20"/>
                 <w:szCs w:val="20"/>
               </w:rPr>
-              <w:t xml:space="preserve">3</w:t>
+              <w:t xml:space="preserve">9</w:t>
             </w:r>
           </w:p>
           <w:p>
@@ -31293,7 +31279,7 @@
                 <w:sz w:val="20"/>
                 <w:szCs w:val="20"/>
               </w:rPr>
-              <w:t xml:space="preserve">54</w:t>
+              <w:t xml:space="preserve">70</w:t>
             </w:r>
           </w:p>
         </w:tc>
@@ -31370,7 +31356,7 @@
                 <w:sz w:val="20"/>
                 <w:szCs w:val="20"/>
               </w:rPr>
-              <w:t xml:space="preserve">Total: ₱97.50</w:t>
+              <w:t xml:space="preserve">Total: ₱186.75</w:t>
             </w:r>
           </w:p>
         </w:tc>
@@ -31447,7 +31433,7 @@
                 <w:sz w:val="20"/>
                 <w:szCs w:val="20"/>
               </w:rPr>
-              <w:t xml:space="preserve">35</w:t>
+              <w:t xml:space="preserve">45</w:t>
             </w:r>
           </w:p>
         </w:tc>
@@ -31524,7 +31510,7 @@
                 <w:sz w:val="20"/>
                 <w:szCs w:val="20"/>
               </w:rPr>
-              <w:t xml:space="preserve">8</w:t>
+              <w:t xml:space="preserve">12</w:t>
             </w:r>
           </w:p>
           <w:p>
@@ -31537,7 +31523,7 @@
                 <w:sz w:val="20"/>
                 <w:szCs w:val="20"/>
               </w:rPr>
-              <w:t xml:space="preserve">5</w:t>
+              <w:t xml:space="preserve">4</w:t>
             </w:r>
           </w:p>
         </w:tc>
@@ -31691,7 +31677,7 @@
                 <w:sz w:val="20"/>
                 <w:szCs w:val="20"/>
               </w:rPr>
-              <w:t xml:space="preserve">True</w:t>
+              <w:t xml:space="preserve">False</w:t>
             </w:r>
           </w:p>
         </w:tc>
@@ -31768,7 +31754,7 @@
                 <w:sz w:val="20"/>
                 <w:szCs w:val="20"/>
               </w:rPr>
-              <w:t xml:space="preserve">375</w:t>
+              <w:t xml:space="preserve">250</w:t>
             </w:r>
           </w:p>
         </w:tc>
@@ -31858,7 +31844,7 @@
                 <w:sz w:val="20"/>
                 <w:szCs w:val="20"/>
               </w:rPr>
-              <w:t xml:space="preserve">10</w:t>
+              <w:t xml:space="preserve">13</w:t>
             </w:r>
           </w:p>
         </w:tc>
@@ -31935,7 +31921,7 @@
                 <w:sz w:val="20"/>
                 <w:szCs w:val="20"/>
               </w:rPr>
-              <w:t xml:space="preserve">Pay: ₱49.50</w:t>
+              <w:t xml:space="preserve">Cost: ₱100.00</w:t>
             </w:r>
           </w:p>
           <w:p>
@@ -31988,7 +31974,7 @@
           <w:sz w:val="24"/>
           <w:szCs w:val="24"/>
         </w:rPr>
-        <w:t xml:space="preserve">SyntaxError: cannot assign to expression here (the hyphen in total-score is read as subtraction).</w:t>
+        <w:t xml:space="preserve">SyntaxError: cannot assign to expression here (the hyphen in unit-cost is read as subtraction).</w:t>
       </w:r>
     </w:p>
     <w:p>
@@ -32062,7 +32048,7 @@
                 <w:sz w:val="20"/>
                 <w:szCs w:val="20"/>
               </w:rPr>
-              <w:t xml:space="preserve">total_score = 82</w:t>
+              <w:t xml:space="preserve">unit_cost = 45</w:t>
             </w:r>
           </w:p>
           <w:p>
@@ -32075,7 +32061,7 @@
                 <w:sz w:val="20"/>
                 <w:szCs w:val="20"/>
               </w:rPr>
-              <w:t xml:space="preserve">print(total_score)</w:t>
+              <w:t xml:space="preserve">print(unit_cost)</w:t>
             </w:r>
           </w:p>
         </w:tc>
@@ -32096,7 +32082,7 @@
           <w:sz w:val="24"/>
           <w:szCs w:val="24"/>
         </w:rPr>
-        <w:t xml:space="preserve">Output: 82</w:t>
+        <w:t xml:space="preserve">Output: 45</w:t>
       </w:r>
     </w:p>
     <w:p>
@@ -32195,7 +32181,7 @@
                 <w:sz w:val="20"/>
                 <w:szCs w:val="20"/>
               </w:rPr>
-              <w:t xml:space="preserve">print("Hello, Class!")</w:t>
+              <w:t xml:space="preserve">print("Good morning!")</w:t>
             </w:r>
           </w:p>
         </w:tc>
@@ -32216,7 +32202,7 @@
           <w:sz w:val="24"/>
           <w:szCs w:val="24"/>
         </w:rPr>
-        <w:t xml:space="preserve">Output: Hello, Class!</w:t>
+        <w:t xml:space="preserve">Output: Good morning!</w:t>
       </w:r>
     </w:p>
     <w:p>
@@ -32315,7 +32301,7 @@
                 <w:sz w:val="20"/>
                 <w:szCs w:val="20"/>
               </w:rPr>
-              <w:t xml:space="preserve">greeting = "Welcome to CPP102"</w:t>
+              <w:t xml:space="preserve">course = "Bachelor of Science"</w:t>
             </w:r>
           </w:p>
           <w:p>
@@ -32328,7 +32314,7 @@
                 <w:sz w:val="20"/>
                 <w:szCs w:val="20"/>
               </w:rPr>
-              <w:t xml:space="preserve">print(greeting)</w:t>
+              <w:t xml:space="preserve">print(course)</w:t>
             </w:r>
           </w:p>
         </w:tc>
@@ -32349,7 +32335,7 @@
           <w:sz w:val="24"/>
           <w:szCs w:val="24"/>
         </w:rPr>
-        <w:t xml:space="preserve">Output: Welcome to CPP102</w:t>
+        <w:t xml:space="preserve">Output: Bachelor of Science</w:t>
       </w:r>
     </w:p>
     <w:p>
@@ -32448,7 +32434,7 @@
                 <w:sz w:val="20"/>
                 <w:szCs w:val="20"/>
               </w:rPr>
-              <w:t xml:space="preserve">label = "Total: "</w:t>
+              <w:t xml:space="preserve">header = "Score: "</w:t>
             </w:r>
           </w:p>
           <w:p>
@@ -32461,7 +32447,7 @@
                 <w:sz w:val="20"/>
                 <w:szCs w:val="20"/>
               </w:rPr>
-              <w:t xml:space="preserve">amount = 150</w:t>
+              <w:t xml:space="preserve">value = 95</w:t>
             </w:r>
           </w:p>
           <w:p>
@@ -32474,7 +32460,7 @@
                 <w:sz w:val="20"/>
                 <w:szCs w:val="20"/>
               </w:rPr>
-              <w:t xml:space="preserve">print(label + str(amount))</w:t>
+              <w:t xml:space="preserve">print(header + str(value))</w:t>
             </w:r>
           </w:p>
         </w:tc>
@@ -32495,7 +32481,7 @@
           <w:sz w:val="24"/>
           <w:szCs w:val="24"/>
         </w:rPr>
-        <w:t xml:space="preserve">Output: Total: 150</w:t>
+        <w:t xml:space="preserve">Output: Score: 95</w:t>
       </w:r>
     </w:p>
     <w:p>
@@ -32520,7 +32506,7 @@
           <w:sz w:val="24"/>
           <w:szCs w:val="24"/>
         </w:rPr>
-        <w:t xml:space="preserve">No crash, but the formula is wrong: perimeter should be 2 * (length + width), not length + width.</w:t>
+        <w:t xml:space="preserve">No crash, but the formula is wrong: area should be length * width, not length + width.</w:t>
       </w:r>
     </w:p>
     <w:p>
@@ -32594,7 +32580,7 @@
                 <w:sz w:val="20"/>
                 <w:szCs w:val="20"/>
               </w:rPr>
-              <w:t xml:space="preserve">length = 8</w:t>
+              <w:t xml:space="preserve">length = 10</w:t>
             </w:r>
           </w:p>
           <w:p>
@@ -32607,7 +32593,7 @@
                 <w:sz w:val="20"/>
                 <w:szCs w:val="20"/>
               </w:rPr>
-              <w:t xml:space="preserve">width = 5</w:t>
+              <w:t xml:space="preserve">width = 6</w:t>
             </w:r>
           </w:p>
           <w:p>
@@ -32620,7 +32606,7 @@
                 <w:sz w:val="20"/>
                 <w:szCs w:val="20"/>
               </w:rPr>
-              <w:t xml:space="preserve">perimeter = 2 * (length + width)</w:t>
+              <w:t xml:space="preserve">area = length * width</w:t>
             </w:r>
           </w:p>
           <w:p>
@@ -32633,7 +32619,7 @@
                 <w:sz w:val="20"/>
                 <w:szCs w:val="20"/>
               </w:rPr>
-              <w:t xml:space="preserve">print(f"Perimeter: {perimeter}")</w:t>
+              <w:t xml:space="preserve">print(f"Area: {area}")</w:t>
             </w:r>
           </w:p>
         </w:tc>
@@ -32654,7 +32640,7 @@
           <w:sz w:val="24"/>
           <w:szCs w:val="24"/>
         </w:rPr>
-        <w:t xml:space="preserve">Output: Perimeter: 26</w:t>
+        <w:t xml:space="preserve">Output: Area: 60</w:t>
       </w:r>
     </w:p>
     <w:p>
@@ -32679,7 +32665,7 @@
           <w:sz w:val="24"/>
           <w:szCs w:val="24"/>
         </w:rPr>
-        <w:t xml:space="preserve">NameError: name 'price' is not defined — the variable was declared as pricee (typo) but referenced as price.</w:t>
+        <w:t xml:space="preserve">NameError: name 'rate' is not defined — the variable was declared as raet (typo) but referenced as rate.</w:t>
       </w:r>
     </w:p>
     <w:p>
@@ -32753,7 +32739,7 @@
                 <w:sz w:val="20"/>
                 <w:szCs w:val="20"/>
               </w:rPr>
-              <w:t xml:space="preserve">price = 45.00</w:t>
+              <w:t xml:space="preserve">rate = 8.5</w:t>
             </w:r>
           </w:p>
           <w:p>
@@ -32766,7 +32752,7 @@
                 <w:sz w:val="20"/>
                 <w:szCs w:val="20"/>
               </w:rPr>
-              <w:t xml:space="preserve">quantity = 3</w:t>
+              <w:t xml:space="preserve">hours = 4</w:t>
             </w:r>
           </w:p>
           <w:p>
@@ -32779,7 +32765,7 @@
                 <w:sz w:val="20"/>
                 <w:szCs w:val="20"/>
               </w:rPr>
-              <w:t xml:space="preserve">total = price * quantity</w:t>
+              <w:t xml:space="preserve">pay = hours * rate</w:t>
             </w:r>
           </w:p>
           <w:p>
@@ -32792,7 +32778,7 @@
                 <w:sz w:val="20"/>
                 <w:szCs w:val="20"/>
               </w:rPr>
-              <w:t xml:space="preserve">print(total)</w:t>
+              <w:t xml:space="preserve">print(pay)</w:t>
             </w:r>
           </w:p>
         </w:tc>
@@ -32813,7 +32799,7 @@
           <w:sz w:val="24"/>
           <w:szCs w:val="24"/>
         </w:rPr>
-        <w:t xml:space="preserve">Output: 135.0</w:t>
+        <w:t xml:space="preserve">Output: 34.0</w:t>
       </w:r>
     </w:p>
     <w:p>
@@ -32838,7 +32824,7 @@
           <w:sz w:val="24"/>
           <w:szCs w:val="24"/>
         </w:rPr>
-        <w:t xml:space="preserve">SyntaxError: cannot assign to False — True, False, and None are reserved keywords/constants in Python and can never be used as variable names.</w:t>
+        <w:t xml:space="preserve">SyntaxError: cannot assign to None — True, False, and None are reserved keywords/constants in Python and can never be used as variable names.</w:t>
       </w:r>
     </w:p>
     <w:p>
@@ -32912,7 +32898,7 @@
                 <w:sz w:val="20"/>
                 <w:szCs w:val="20"/>
               </w:rPr>
-              <w:t xml:space="preserve">exam_passed = 10</w:t>
+              <w:t xml:space="preserve">result_value = 5</w:t>
             </w:r>
           </w:p>
           <w:p>
@@ -32925,7 +32911,7 @@
                 <w:sz w:val="20"/>
                 <w:szCs w:val="20"/>
               </w:rPr>
-              <w:t xml:space="preserve">print(exam_passed)</w:t>
+              <w:t xml:space="preserve">print(result_value)</w:t>
             </w:r>
           </w:p>
         </w:tc>
@@ -32946,7 +32932,7 @@
           <w:sz w:val="24"/>
           <w:szCs w:val="24"/>
         </w:rPr>
-        <w:t xml:space="preserve">Output: 10</w:t>
+        <w:t xml:space="preserve">Output: 5</w:t>
       </w:r>
     </w:p>
     <w:p>
@@ -32971,7 +32957,7 @@
           <w:sz w:val="24"/>
           <w:szCs w:val="24"/>
         </w:rPr>
-        <w:t xml:space="preserve">TypeError: can't multiply sequence by non-int of type 'float' — hours is still a string from input() and was never converted to a number.</w:t>
+        <w:t xml:space="preserve">TypeError: can't multiply sequence by non-int of type 'float' — quantity is still a string from input() and was never converted to a number.</w:t>
       </w:r>
     </w:p>
     <w:p>
@@ -33045,7 +33031,7 @@
                 <w:sz w:val="20"/>
                 <w:szCs w:val="20"/>
               </w:rPr>
-              <w:t xml:space="preserve">hours = float(input("Enter hours worked: "))</w:t>
+              <w:t xml:space="preserve">quantity = int(input("Enter quantity: "))</w:t>
             </w:r>
           </w:p>
           <w:p>
@@ -33058,7 +33044,7 @@
                 <w:sz w:val="20"/>
                 <w:szCs w:val="20"/>
               </w:rPr>
-              <w:t xml:space="preserve">rate = 55.0</w:t>
+              <w:t xml:space="preserve">price = 95.0</w:t>
             </w:r>
           </w:p>
           <w:p>
@@ -33071,7 +33057,7 @@
                 <w:sz w:val="20"/>
                 <w:szCs w:val="20"/>
               </w:rPr>
-              <w:t xml:space="preserve">pay = hours * rate</w:t>
+              <w:t xml:space="preserve">total = quantity * price</w:t>
             </w:r>
           </w:p>
           <w:p>
@@ -33084,7 +33070,7 @@
                 <w:sz w:val="20"/>
                 <w:szCs w:val="20"/>
               </w:rPr>
-              <w:t xml:space="preserve">print(pay)</w:t>
+              <w:t xml:space="preserve">print(total)</w:t>
             </w:r>
           </w:p>
         </w:tc>
@@ -33105,7 +33091,7 @@
           <w:sz w:val="24"/>
           <w:szCs w:val="24"/>
         </w:rPr>
-        <w:t xml:space="preserve">Output: (numeric pay value, e.g. 440.0 if hours = 8)</w:t>
+        <w:t xml:space="preserve">Output: (numeric total value, e.g. 285.0 if quantity = 3)</w:t>
       </w:r>
     </w:p>
     <w:p>
@@ -33191,7 +33177,7 @@
                 <w:sz w:val="20"/>
                 <w:szCs w:val="20"/>
               </w:rPr>
-              <w:t xml:space="preserve">item_qty = int(input("Enter quantity: "))</w:t>
+              <w:t xml:space="preserve">qty = int(input("Enter quantity: "))</w:t>
             </w:r>
           </w:p>
           <w:p>
@@ -33204,7 +33190,7 @@
                 <w:sz w:val="20"/>
                 <w:szCs w:val="20"/>
               </w:rPr>
-              <w:t xml:space="preserve">item_price = float(input("Enter unit price: "))</w:t>
+              <w:t xml:space="preserve">unit_price = float(input("Enter unit price: "))</w:t>
             </w:r>
           </w:p>
           <w:p>
@@ -33217,7 +33203,7 @@
                 <w:sz w:val="20"/>
                 <w:szCs w:val="20"/>
               </w:rPr>
-              <w:t xml:space="preserve">total = item_qty * item_price</w:t>
+              <w:t xml:space="preserve">total = qty * unit_price</w:t>
             </w:r>
           </w:p>
           <w:p>
@@ -33251,7 +33237,7 @@
           <w:sz w:val="24"/>
           <w:szCs w:val="24"/>
         </w:rPr>
-        <w:t xml:space="preserve">Given: item_qty = 6, item_price = 18.75   →   Expected Output: Total Price: ₱112.50</w:t>
+        <w:t xml:space="preserve">Given: qty = 8, unit_price = 22.75   →   Expected Output: Total Price: ₱182.00</w:t>
       </w:r>
     </w:p>
     <w:p>
@@ -33268,7 +33254,7 @@
           <w:sz w:val="24"/>
           <w:szCs w:val="24"/>
         </w:rPr>
-        <w:t xml:space="preserve">F2 — Student's Average Score: </w:t>
+        <w:t xml:space="preserve">F2 — Average of Three Test Scores: </w:t>
       </w:r>
       <w:r>
         <w:rPr>
@@ -33325,7 +33311,7 @@
                 <w:sz w:val="20"/>
                 <w:szCs w:val="20"/>
               </w:rPr>
-              <w:t xml:space="preserve">q1 = float(input("Enter first quiz score: "))</w:t>
+              <w:t xml:space="preserve">score1 = float(input("Enter first score: "))</w:t>
             </w:r>
           </w:p>
           <w:p>
@@ -33338,7 +33324,7 @@
                 <w:sz w:val="20"/>
                 <w:szCs w:val="20"/>
               </w:rPr>
-              <w:t xml:space="preserve">q2 = float(input("Enter second quiz score: "))</w:t>
+              <w:t xml:space="preserve">score2 = float(input("Enter second score: "))</w:t>
             </w:r>
           </w:p>
           <w:p>
@@ -33351,7 +33337,7 @@
                 <w:sz w:val="20"/>
                 <w:szCs w:val="20"/>
               </w:rPr>
-              <w:t xml:space="preserve">q3 = float(input("Enter third quiz score: "))</w:t>
+              <w:t xml:space="preserve">score3 = float(input("Enter third score: "))</w:t>
             </w:r>
           </w:p>
           <w:p>
@@ -33364,7 +33350,7 @@
                 <w:sz w:val="20"/>
                 <w:szCs w:val="20"/>
               </w:rPr>
-              <w:t xml:space="preserve">average = (q1 + q2 + q3) / 3</w:t>
+              <w:t xml:space="preserve">average = (score1 + score2 + score3) / 3</w:t>
             </w:r>
           </w:p>
           <w:p>
@@ -33398,7 +33384,7 @@
           <w:sz w:val="24"/>
           <w:szCs w:val="24"/>
         </w:rPr>
-        <w:t xml:space="preserve">Given: q1 = 88, q2 = 92, q3 = 79   →   Expected Output: Average: 86.33</w:t>
+        <w:t xml:space="preserve">Given: score1 = 76, score2 = 85, score3 = 91   →   Expected Output: Average: 84.00</w:t>
       </w:r>
     </w:p>
     <w:p>
@@ -33532,7 +33518,7 @@
           <w:sz w:val="24"/>
           <w:szCs w:val="24"/>
         </w:rPr>
-        <w:t xml:space="preserve">Given: hours = 22, rate = 65.00   →   Expected Output: Gross Pay: ₱1430.00</w:t>
+        <w:t xml:space="preserve">Given: hours = 35, rate = 58.00   →   Expected Output: Gross Pay: ₱2030.00</w:t>
       </w:r>
     </w:p>
     <w:p>
@@ -33666,7 +33652,7 @@
           <w:sz w:val="24"/>
           <w:szCs w:val="24"/>
         </w:rPr>
-        <w:t xml:space="preserve">Given: speed = 60.0, time = 2.5   →   Expected Output: Distance: 150.00 km</w:t>
+        <w:t xml:space="preserve">Given: speed = 45, time = 3.2   →   Expected Output: Distance: 144.00 km</w:t>
       </w:r>
     </w:p>
     <w:p>
@@ -33787,7 +33773,7 @@
           <w:sz w:val="24"/>
           <w:szCs w:val="24"/>
         </w:rPr>
-        <w:t xml:space="preserve">Given: celsius = 30   →   Expected Output: Fahrenheit: 86.00</w:t>
+        <w:t xml:space="preserve">Given: celsius = 18   →   Expected Output: Fahrenheit: 64.40</w:t>
       </w:r>
     </w:p>
     <w:p>
@@ -33921,7 +33907,7 @@
           <w:sz w:val="24"/>
           <w:szCs w:val="24"/>
         </w:rPr>
-        <w:t xml:space="preserve">Given: allowance = 300.0, expenses = 175.50   →   Expected Output: Remaining: ₱124.50</w:t>
+        <w:t xml:space="preserve">Given: allowance = 250.0, expenses = 142.25   →   Expected Output: Remaining: ₱107.75</w:t>
       </w:r>
     </w:p>
     <w:p>
@@ -34055,7 +34041,7 @@
           <w:sz w:val="24"/>
           <w:szCs w:val="24"/>
         </w:rPr>
-        <w:t xml:space="preserve">Given: length = 12.5, width = 4.0   →   Expected Output: Area: 50.00</w:t>
+        <w:t xml:space="preserve">Given: length = 15.0, width = 3.5   →   Expected Output: Area: 52.50</w:t>
       </w:r>
     </w:p>
     <w:p>
@@ -34189,7 +34175,7 @@
           <w:sz w:val="24"/>
           <w:szCs w:val="24"/>
         </w:rPr>
-        <w:t xml:space="preserve">Given: price = 235.00, amount_paid = 300.00   →   Expected Output: Change: ₱65.00</w:t>
+        <w:t xml:space="preserve">Given: price = 189.50, amount_paid = 200.00   →   Expected Output: Change: ₱10.50</w:t>
       </w:r>
     </w:p>
     <w:p>
@@ -34213,7 +34199,7 @@
         <w:rPr>
           <w:rFonts w:ascii="Arial" w:cs="Arial" w:eastAsia="Arial" w:hAnsi="Arial"/>
         </w:rPr>
-        <w:t xml:space="preserve">G1: School Supply Purchase</w:t>
+        <w:t xml:space="preserve">G1: Art Supplies Purchase</w:t>
       </w:r>
     </w:p>
     <w:p>
@@ -34401,7 +34387,7 @@
                 <w:sz w:val="24"/>
                 <w:szCs w:val="24"/>
               </w:rPr>
-              <w:t xml:space="preserve">Number and price of bond paper reams, ballpens, and folders</w:t>
+              <w:t xml:space="preserve">Number and price of canvas boards, paintbrushes, and paint tubes</w:t>
             </w:r>
           </w:p>
         </w:tc>
@@ -34433,7 +34419,7 @@
                 <w:sz w:val="24"/>
                 <w:szCs w:val="24"/>
               </w:rPr>
-              <w:t xml:space="preserve">Compute the cost of paper, cost of pens, cost of folders, then the total purchase amount</w:t>
+              <w:t xml:space="preserve">Compute the cost of canvas, brushes, and paint, then the total purchase amount</w:t>
             </w:r>
           </w:p>
         </w:tc>
@@ -34534,7 +34520,7 @@
           <w:sz w:val="24"/>
           <w:szCs w:val="24"/>
         </w:rPr>
-        <w:t xml:space="preserve">2. Input the number and price of bond paper reams.</w:t>
+        <w:t xml:space="preserve">2. Input the number and price of canvas boards.</w:t>
       </w:r>
     </w:p>
     <w:p>
@@ -34552,7 +34538,7 @@
           <w:sz w:val="24"/>
           <w:szCs w:val="24"/>
         </w:rPr>
-        <w:t xml:space="preserve">3. Input the number and price of ballpens.</w:t>
+        <w:t xml:space="preserve">3. Input the number and price of paintbrushes.</w:t>
       </w:r>
     </w:p>
     <w:p>
@@ -34570,7 +34556,7 @@
           <w:sz w:val="24"/>
           <w:szCs w:val="24"/>
         </w:rPr>
-        <w:t xml:space="preserve">4. Input the number and price of folders.</w:t>
+        <w:t xml:space="preserve">4. Input the number and price of paint tubes.</w:t>
       </w:r>
     </w:p>
     <w:p>
@@ -34588,7 +34574,7 @@
           <w:sz w:val="24"/>
           <w:szCs w:val="24"/>
         </w:rPr>
-        <w:t xml:space="preserve">5. Compute the paper cost.</w:t>
+        <w:t xml:space="preserve">5. Compute the canvas cost.</w:t>
       </w:r>
     </w:p>
     <w:p>
@@ -34606,7 +34592,7 @@
           <w:sz w:val="24"/>
           <w:szCs w:val="24"/>
         </w:rPr>
-        <w:t xml:space="preserve">6. Compute the pen cost.</w:t>
+        <w:t xml:space="preserve">6. Compute the brush cost.</w:t>
       </w:r>
     </w:p>
     <w:p>
@@ -34624,7 +34610,7 @@
           <w:sz w:val="24"/>
           <w:szCs w:val="24"/>
         </w:rPr>
-        <w:t xml:space="preserve">7. Compute the folder cost.</w:t>
+        <w:t xml:space="preserve">7. Compute the paint cost.</w:t>
       </w:r>
     </w:p>
     <w:p>
@@ -34770,7 +34756,7 @@
                 <w:sz w:val="20"/>
                 <w:szCs w:val="20"/>
               </w:rPr>
-              <w:t xml:space="preserve">INPUT reams, ream_price</w:t>
+              <w:t xml:space="preserve">INPUT canvas_qty, canvas_price</w:t>
             </w:r>
           </w:p>
           <w:p>
@@ -34783,7 +34769,7 @@
                 <w:sz w:val="20"/>
                 <w:szCs w:val="20"/>
               </w:rPr>
-              <w:t xml:space="preserve">INPUT pens, pen_price</w:t>
+              <w:t xml:space="preserve">INPUT brush_qty, brush_price</w:t>
             </w:r>
           </w:p>
           <w:p>
@@ -34796,7 +34782,7 @@
                 <w:sz w:val="20"/>
                 <w:szCs w:val="20"/>
               </w:rPr>
-              <w:t xml:space="preserve">INPUT folders, folder_price</w:t>
+              <w:t xml:space="preserve">INPUT paint_qty, paint_price</w:t>
             </w:r>
           </w:p>
           <w:p>
@@ -34809,7 +34795,7 @@
                 <w:sz w:val="20"/>
                 <w:szCs w:val="20"/>
               </w:rPr>
-              <w:t xml:space="preserve">paper_cost = reams * ream_price</w:t>
+              <w:t xml:space="preserve">canvas_cost = canvas_qty * canvas_price</w:t>
             </w:r>
           </w:p>
           <w:p>
@@ -34822,7 +34808,7 @@
                 <w:sz w:val="20"/>
                 <w:szCs w:val="20"/>
               </w:rPr>
-              <w:t xml:space="preserve">pen_cost = pens * pen_price</w:t>
+              <w:t xml:space="preserve">brush_cost = brush_qty * brush_price</w:t>
             </w:r>
           </w:p>
           <w:p>
@@ -34835,7 +34821,7 @@
                 <w:sz w:val="20"/>
                 <w:szCs w:val="20"/>
               </w:rPr>
-              <w:t xml:space="preserve">folder_cost = folders * folder_price</w:t>
+              <w:t xml:space="preserve">paint_cost = paint_qty * paint_price</w:t>
             </w:r>
           </w:p>
           <w:p>
@@ -34848,7 +34834,7 @@
                 <w:sz w:val="20"/>
                 <w:szCs w:val="20"/>
               </w:rPr>
-              <w:t xml:space="preserve">total_purchase = paper_cost + pen_cost + folder_cost</w:t>
+              <w:t xml:space="preserve">total_purchase = canvas_cost + brush_cost + paint_cost</w:t>
             </w:r>
           </w:p>
           <w:p>
@@ -35021,7 +35007,7 @@
                 <w:sz w:val="20"/>
                 <w:szCs w:val="20"/>
               </w:rPr>
-              <w:t xml:space="preserve">reams = int(input("Enter number of bond paper reams: "))</w:t>
+              <w:t xml:space="preserve">canvas_qty = int(input("Enter number of canvas boards: "))</w:t>
             </w:r>
           </w:p>
           <w:p>
@@ -35034,7 +35020,7 @@
                 <w:sz w:val="20"/>
                 <w:szCs w:val="20"/>
               </w:rPr>
-              <w:t xml:space="preserve">ream_price = float(input("Enter price per ream: "))</w:t>
+              <w:t xml:space="preserve">canvas_price = float(input("Enter price per board: "))</w:t>
             </w:r>
           </w:p>
           <w:p>
@@ -35047,7 +35033,7 @@
                 <w:sz w:val="20"/>
                 <w:szCs w:val="20"/>
               </w:rPr>
-              <w:t xml:space="preserve">pens = int(input("Enter number of ballpens: "))</w:t>
+              <w:t xml:space="preserve">brush_qty = int(input("Enter number of paintbrushes: "))</w:t>
             </w:r>
           </w:p>
           <w:p>
@@ -35060,7 +35046,7 @@
                 <w:sz w:val="20"/>
                 <w:szCs w:val="20"/>
               </w:rPr>
-              <w:t xml:space="preserve">pen_price = float(input("Enter price per ballpen: "))</w:t>
+              <w:t xml:space="preserve">brush_price = float(input("Enter price per paintbrush: "))</w:t>
             </w:r>
           </w:p>
           <w:p>
@@ -35073,7 +35059,7 @@
                 <w:sz w:val="20"/>
                 <w:szCs w:val="20"/>
               </w:rPr>
-              <w:t xml:space="preserve">folders = int(input("Enter number of folders: "))</w:t>
+              <w:t xml:space="preserve">paint_qty = int(input("Enter number of paint tubes: "))</w:t>
             </w:r>
           </w:p>
           <w:p>
@@ -35086,7 +35072,7 @@
                 <w:sz w:val="20"/>
                 <w:szCs w:val="20"/>
               </w:rPr>
-              <w:t xml:space="preserve">folder_price = float(input("Enter price per folder: "))</w:t>
+              <w:t xml:space="preserve">paint_price = float(input("Enter price per tube: "))</w:t>
             </w:r>
           </w:p>
           <w:p>
@@ -35112,7 +35098,7 @@
                 <w:sz w:val="20"/>
                 <w:szCs w:val="20"/>
               </w:rPr>
-              <w:t xml:space="preserve">paper_cost = reams * ream_price</w:t>
+              <w:t xml:space="preserve">canvas_cost = canvas_qty * canvas_price</w:t>
             </w:r>
           </w:p>
           <w:p>
@@ -35125,7 +35111,7 @@
                 <w:sz w:val="20"/>
                 <w:szCs w:val="20"/>
               </w:rPr>
-              <w:t xml:space="preserve">pen_cost = pens * pen_price</w:t>
+              <w:t xml:space="preserve">brush_cost = brush_qty * brush_price</w:t>
             </w:r>
           </w:p>
           <w:p>
@@ -35138,7 +35124,7 @@
                 <w:sz w:val="20"/>
                 <w:szCs w:val="20"/>
               </w:rPr>
-              <w:t xml:space="preserve">folder_cost = folders * folder_price</w:t>
+              <w:t xml:space="preserve">paint_cost = paint_qty * paint_price</w:t>
             </w:r>
           </w:p>
           <w:p>
@@ -35151,7 +35137,7 @@
                 <w:sz w:val="20"/>
                 <w:szCs w:val="20"/>
               </w:rPr>
-              <w:t xml:space="preserve">total_purchase = paper_cost + pen_cost + folder_cost</w:t>
+              <w:t xml:space="preserve">total_purchase = canvas_cost + brush_cost + paint_cost</w:t>
             </w:r>
           </w:p>
           <w:p>
@@ -35254,7 +35240,7 @@
                 <w:sz w:val="20"/>
                 <w:szCs w:val="20"/>
               </w:rPr>
-              <w:t xml:space="preserve">Total Purchase: ₱580.00</w:t>
+              <w:t xml:space="preserve">Total Purchase: ₱1020.00</w:t>
             </w:r>
           </w:p>
         </w:tc>
@@ -35274,7 +35260,7 @@
         <w:rPr>
           <w:rFonts w:ascii="Arial" w:cs="Arial" w:eastAsia="Arial" w:hAnsi="Arial"/>
         </w:rPr>
-        <w:t xml:space="preserve">G2: Average of Three Quiz Scores</w:t>
+        <w:t xml:space="preserve">G2: Average of Three Long Test Scores</w:t>
       </w:r>
     </w:p>
     <w:p>
@@ -35462,7 +35448,7 @@
                 <w:sz w:val="24"/>
                 <w:szCs w:val="24"/>
               </w:rPr>
-              <w:t xml:space="preserve">Three quiz scores</w:t>
+              <w:t xml:space="preserve">Three long test scores</w:t>
             </w:r>
           </w:p>
         </w:tc>
@@ -35595,7 +35581,7 @@
           <w:sz w:val="24"/>
           <w:szCs w:val="24"/>
         </w:rPr>
-        <w:t xml:space="preserve">2. Input the first quiz score.</w:t>
+        <w:t xml:space="preserve">2. Input the first test score.</w:t>
       </w:r>
     </w:p>
     <w:p>
@@ -35613,7 +35599,7 @@
           <w:sz w:val="24"/>
           <w:szCs w:val="24"/>
         </w:rPr>
-        <w:t xml:space="preserve">3. Input the second quiz score.</w:t>
+        <w:t xml:space="preserve">3. Input the second test score.</w:t>
       </w:r>
     </w:p>
     <w:p>
@@ -35631,7 +35617,7 @@
           <w:sz w:val="24"/>
           <w:szCs w:val="24"/>
         </w:rPr>
-        <w:t xml:space="preserve">4. Input the third quiz score.</w:t>
+        <w:t xml:space="preserve">4. Input the third test score.</w:t>
       </w:r>
     </w:p>
     <w:p>
@@ -35777,7 +35763,7 @@
                 <w:sz w:val="20"/>
                 <w:szCs w:val="20"/>
               </w:rPr>
-              <w:t xml:space="preserve">INPUT quiz1</w:t>
+              <w:t xml:space="preserve">INPUT test1</w:t>
             </w:r>
           </w:p>
           <w:p>
@@ -35790,7 +35776,7 @@
                 <w:sz w:val="20"/>
                 <w:szCs w:val="20"/>
               </w:rPr>
-              <w:t xml:space="preserve">INPUT quiz2</w:t>
+              <w:t xml:space="preserve">INPUT test2</w:t>
             </w:r>
           </w:p>
           <w:p>
@@ -35803,7 +35789,7 @@
                 <w:sz w:val="20"/>
                 <w:szCs w:val="20"/>
               </w:rPr>
-              <w:t xml:space="preserve">INPUT quiz3</w:t>
+              <w:t xml:space="preserve">INPUT test3</w:t>
             </w:r>
           </w:p>
           <w:p>
@@ -35816,7 +35802,7 @@
                 <w:sz w:val="20"/>
                 <w:szCs w:val="20"/>
               </w:rPr>
-              <w:t xml:space="preserve">average = (quiz1 + quiz2 + quiz3) / 3</w:t>
+              <w:t xml:space="preserve">average = (test1 + test2 + test3) / 3</w:t>
             </w:r>
           </w:p>
           <w:p>
@@ -35989,7 +35975,7 @@
                 <w:sz w:val="20"/>
                 <w:szCs w:val="20"/>
               </w:rPr>
-              <w:t xml:space="preserve">quiz1 = float(input("Enter first quiz score: "))</w:t>
+              <w:t xml:space="preserve">test1 = float(input("Enter first test score: "))</w:t>
             </w:r>
           </w:p>
           <w:p>
@@ -36002,7 +35988,7 @@
                 <w:sz w:val="20"/>
                 <w:szCs w:val="20"/>
               </w:rPr>
-              <w:t xml:space="preserve">quiz2 = float(input("Enter second quiz score: "))</w:t>
+              <w:t xml:space="preserve">test2 = float(input("Enter second test score: "))</w:t>
             </w:r>
           </w:p>
           <w:p>
@@ -36015,7 +36001,7 @@
                 <w:sz w:val="20"/>
                 <w:szCs w:val="20"/>
               </w:rPr>
-              <w:t xml:space="preserve">quiz3 = float(input("Enter third quiz score: "))</w:t>
+              <w:t xml:space="preserve">test3 = float(input("Enter third test score: "))</w:t>
             </w:r>
           </w:p>
           <w:p>
@@ -36041,7 +36027,7 @@
                 <w:sz w:val="20"/>
                 <w:szCs w:val="20"/>
               </w:rPr>
-              <w:t xml:space="preserve">average = (quiz1 + quiz2 + quiz3) / 3</w:t>
+              <w:t xml:space="preserve">average = (test1 + test2 + test3) / 3</w:t>
             </w:r>
           </w:p>
           <w:p>
@@ -36144,7 +36130,7 @@
                 <w:sz w:val="20"/>
                 <w:szCs w:val="20"/>
               </w:rPr>
-              <w:t xml:space="preserve">Average: 89.67</w:t>
+              <w:t xml:space="preserve">Average: 83.00</w:t>
             </w:r>
           </w:p>
         </w:tc>
@@ -36946,7 +36932,7 @@
                 <w:sz w:val="20"/>
                 <w:szCs w:val="20"/>
               </w:rPr>
-              <w:t xml:space="preserve">Fahrenheit: 75.20</w:t>
+              <w:t xml:space="preserve">Fahrenheit: 59.00</w:t>
             </w:r>
           </w:p>
         </w:tc>
@@ -36966,7 +36952,7 @@
         <w:rPr>
           <w:rFonts w:ascii="Arial" w:cs="Arial" w:eastAsia="Arial" w:hAnsi="Arial"/>
         </w:rPr>
-        <w:t xml:space="preserve">G4: Area and Perimeter of a Rectangular Garden</w:t>
+        <w:t xml:space="preserve">G4: Area and Perimeter of a Classroom Floor</w:t>
       </w:r>
     </w:p>
     <w:p>
@@ -37154,7 +37140,7 @@
                 <w:sz w:val="24"/>
                 <w:szCs w:val="24"/>
               </w:rPr>
-              <w:t xml:space="preserve">Length and width of the garden</w:t>
+              <w:t xml:space="preserve">Length and width of the classroom floor</w:t>
             </w:r>
           </w:p>
         </w:tc>
@@ -37287,7 +37273,7 @@
           <w:sz w:val="24"/>
           <w:szCs w:val="24"/>
         </w:rPr>
-        <w:t xml:space="preserve">2. Input the length of the garden.</w:t>
+        <w:t xml:space="preserve">2. Input the length of the floor.</w:t>
       </w:r>
     </w:p>
     <w:p>
@@ -37305,7 +37291,7 @@
           <w:sz w:val="24"/>
           <w:szCs w:val="24"/>
         </w:rPr>
-        <w:t xml:space="preserve">3. Input the width of the garden.</w:t>
+        <w:t xml:space="preserve">3. Input the width of the floor.</w:t>
       </w:r>
     </w:p>
     <w:p>
@@ -37681,7 +37667,7 @@
                 <w:sz w:val="20"/>
                 <w:szCs w:val="20"/>
               </w:rPr>
-              <w:t xml:space="preserve">length = float(input("Enter the length of the garden (m): "))</w:t>
+              <w:t xml:space="preserve">length = float(input("Enter the length of the floor (m): "))</w:t>
             </w:r>
           </w:p>
           <w:p>
@@ -37694,7 +37680,7 @@
                 <w:sz w:val="20"/>
                 <w:szCs w:val="20"/>
               </w:rPr>
-              <w:t xml:space="preserve">width = float(input("Enter the width of the garden (m): "))</w:t>
+              <w:t xml:space="preserve">width = float(input("Enter the width of the floor (m): "))</w:t>
             </w:r>
           </w:p>
           <w:p>
@@ -37849,7 +37835,7 @@
                 <w:sz w:val="20"/>
                 <w:szCs w:val="20"/>
               </w:rPr>
-              <w:t xml:space="preserve">Area: 58.90 sq. m</w:t>
+              <w:t xml:space="preserve">Area: 79.92 sq. m</w:t>
             </w:r>
           </w:p>
           <w:p>
@@ -37862,7 +37848,7 @@
                 <w:sz w:val="20"/>
                 <w:szCs w:val="20"/>
               </w:rPr>
-              <w:t xml:space="preserve">Perimeter: 31.40 m</w:t>
+              <w:t xml:space="preserve">Perimeter: 36.40 m</w:t>
             </w:r>
           </w:p>
         </w:tc>
@@ -37882,7 +37868,7 @@
         <w:rPr>
           <w:rFonts w:ascii="Arial" w:cs="Arial" w:eastAsia="Arial" w:hAnsi="Arial"/>
         </w:rPr>
-        <w:t xml:space="preserve">G5: Gross Salary Based on Hours Worked</w:t>
+        <w:t xml:space="preserve">G5: Tutor's Salary Based on Hours Worked</w:t>
       </w:r>
     </w:p>
     <w:p>
@@ -38070,7 +38056,7 @@
                 <w:sz w:val="24"/>
                 <w:szCs w:val="24"/>
               </w:rPr>
-              <w:t xml:space="preserve">Hours worked and hourly rate</w:t>
+              <w:t xml:space="preserve">Hours tutored and hourly rate</w:t>
             </w:r>
           </w:p>
         </w:tc>
@@ -38102,7 +38088,7 @@
                 <w:sz w:val="24"/>
                 <w:szCs w:val="24"/>
               </w:rPr>
-              <w:t xml:space="preserve">Multiply hours worked by the hourly rate</w:t>
+              <w:t xml:space="preserve">Multiply hours tutored by the hourly rate</w:t>
             </w:r>
           </w:p>
         </w:tc>
@@ -38203,7 +38189,7 @@
           <w:sz w:val="24"/>
           <w:szCs w:val="24"/>
         </w:rPr>
-        <w:t xml:space="preserve">2. Input the number of hours worked.</w:t>
+        <w:t xml:space="preserve">2. Input the number of hours tutored.</w:t>
       </w:r>
     </w:p>
     <w:p>
@@ -38367,7 +38353,7 @@
                 <w:sz w:val="20"/>
                 <w:szCs w:val="20"/>
               </w:rPr>
-              <w:t xml:space="preserve">INPUT hours_worked</w:t>
+              <w:t xml:space="preserve">INPUT hours_tutored</w:t>
             </w:r>
           </w:p>
           <w:p>
@@ -38393,7 +38379,7 @@
                 <w:sz w:val="20"/>
                 <w:szCs w:val="20"/>
               </w:rPr>
-              <w:t xml:space="preserve">gross_pay = hours_worked * hourly_rate</w:t>
+              <w:t xml:space="preserve">gross_pay = hours_tutored * hourly_rate</w:t>
             </w:r>
           </w:p>
           <w:p>
@@ -38566,7 +38552,7 @@
                 <w:sz w:val="20"/>
                 <w:szCs w:val="20"/>
               </w:rPr>
-              <w:t xml:space="preserve">hours_worked = float(input("Enter number of hours worked: "))</w:t>
+              <w:t xml:space="preserve">hours_tutored = float(input("Enter hours tutored: "))</w:t>
             </w:r>
           </w:p>
           <w:p>
@@ -38605,7 +38591,7 @@
                 <w:sz w:val="20"/>
                 <w:szCs w:val="20"/>
               </w:rPr>
-              <w:t xml:space="preserve">gross_pay = hours_worked * hourly_rate</w:t>
+              <w:t xml:space="preserve">gross_pay = hours_tutored * hourly_rate</w:t>
             </w:r>
           </w:p>
           <w:p>
@@ -38708,7 +38694,7 @@
                 <w:sz w:val="20"/>
                 <w:szCs w:val="20"/>
               </w:rPr>
-              <w:t xml:space="preserve">Gross Pay: ₱3800.00</w:t>
+              <w:t xml:space="preserve">Gross Pay: ₱1800.00</w:t>
             </w:r>
           </w:p>
         </w:tc>
@@ -38728,7 +38714,7 @@
         <w:rPr>
           <w:rFonts w:ascii="Arial" w:cs="Arial" w:eastAsia="Arial" w:hAnsi="Arial"/>
         </w:rPr>
-        <w:t xml:space="preserve">G6: Change from an Amount Paid</w:t>
+        <w:t xml:space="preserve">G6: Change from an Amount Paid at the Canteen</w:t>
       </w:r>
     </w:p>
     <w:p>
@@ -38916,7 +38902,7 @@
                 <w:sz w:val="24"/>
                 <w:szCs w:val="24"/>
               </w:rPr>
-              <w:t xml:space="preserve">Price of the item and amount paid</w:t>
+              <w:t xml:space="preserve">Price of the meal and amount paid</w:t>
             </w:r>
           </w:p>
         </w:tc>
@@ -39049,7 +39035,7 @@
           <w:sz w:val="24"/>
           <w:szCs w:val="24"/>
         </w:rPr>
-        <w:t xml:space="preserve">2. Input the price of the item.</w:t>
+        <w:t xml:space="preserve">2. Input the price of the meal.</w:t>
       </w:r>
     </w:p>
     <w:p>
@@ -39412,7 +39398,7 @@
                 <w:sz w:val="20"/>
                 <w:szCs w:val="20"/>
               </w:rPr>
-              <w:t xml:space="preserve">price = float(input("Enter the price of the item: "))</w:t>
+              <w:t xml:space="preserve">price = float(input("Enter the price of the meal: "))</w:t>
             </w:r>
           </w:p>
           <w:p>
@@ -39554,7 +39540,7 @@
                 <w:sz w:val="20"/>
                 <w:szCs w:val="20"/>
               </w:rPr>
-              <w:t xml:space="preserve">Change: ₱41.25</w:t>
+              <w:t xml:space="preserve">Change: ₱12.50</w:t>
             </w:r>
           </w:p>
         </w:tc>
@@ -39574,7 +39560,7 @@
         <w:rPr>
           <w:rFonts w:ascii="Arial" w:cs="Arial" w:eastAsia="Arial" w:hAnsi="Arial"/>
         </w:rPr>
-        <w:t xml:space="preserve">G7: Remaining Student Allowance</w:t>
+        <w:t xml:space="preserve">G7: Remaining Daily Allowance</w:t>
       </w:r>
     </w:p>
     <w:p>
@@ -39762,7 +39748,7 @@
                 <w:sz w:val="24"/>
                 <w:szCs w:val="24"/>
               </w:rPr>
-              <w:t xml:space="preserve">Weekly allowance, fare, food, and load expenses</w:t>
+              <w:t xml:space="preserve">Daily allowance, fare, snacks, and printing expenses</w:t>
             </w:r>
           </w:p>
         </w:tc>
@@ -39794,7 +39780,7 @@
                 <w:sz w:val="24"/>
                 <w:szCs w:val="24"/>
               </w:rPr>
-              <w:t xml:space="preserve">Subtract fare, food, and load from the allowance</w:t>
+              <w:t xml:space="preserve">Subtract fare, snacks, and printing from the allowance</w:t>
             </w:r>
           </w:p>
         </w:tc>
@@ -39895,7 +39881,7 @@
           <w:sz w:val="24"/>
           <w:szCs w:val="24"/>
         </w:rPr>
-        <w:t xml:space="preserve">2. Input the weekly allowance.</w:t>
+        <w:t xml:space="preserve">2. Input the daily allowance.</w:t>
       </w:r>
     </w:p>
     <w:p>
@@ -39913,7 +39899,7 @@
           <w:sz w:val="24"/>
           <w:szCs w:val="24"/>
         </w:rPr>
-        <w:t xml:space="preserve">3. Input the transportation fare expense.</w:t>
+        <w:t xml:space="preserve">3. Input the jeepney fare expense.</w:t>
       </w:r>
     </w:p>
     <w:p>
@@ -39931,7 +39917,7 @@
           <w:sz w:val="24"/>
           <w:szCs w:val="24"/>
         </w:rPr>
-        <w:t xml:space="preserve">4. Input the food expense.</w:t>
+        <w:t xml:space="preserve">4. Input the snacks expense.</w:t>
       </w:r>
     </w:p>
     <w:p>
@@ -39949,7 +39935,7 @@
           <w:sz w:val="24"/>
           <w:szCs w:val="24"/>
         </w:rPr>
-        <w:t xml:space="preserve">5. Input the load expense.</w:t>
+        <w:t xml:space="preserve">5. Input the printing expense.</w:t>
       </w:r>
     </w:p>
     <w:p>
@@ -40121,7 +40107,7 @@
                 <w:sz w:val="20"/>
                 <w:szCs w:val="20"/>
               </w:rPr>
-              <w:t xml:space="preserve">INPUT food</w:t>
+              <w:t xml:space="preserve">INPUT snacks</w:t>
             </w:r>
           </w:p>
           <w:p>
@@ -40134,7 +40120,7 @@
                 <w:sz w:val="20"/>
                 <w:szCs w:val="20"/>
               </w:rPr>
-              <w:t xml:space="preserve">INPUT load</w:t>
+              <w:t xml:space="preserve">INPUT printing</w:t>
             </w:r>
           </w:p>
           <w:p>
@@ -40147,7 +40133,7 @@
                 <w:sz w:val="20"/>
                 <w:szCs w:val="20"/>
               </w:rPr>
-              <w:t xml:space="preserve">remaining = allowance - fare - food - load</w:t>
+              <w:t xml:space="preserve">remaining = allowance - fare - snacks - printing</w:t>
             </w:r>
           </w:p>
           <w:p>
@@ -40320,7 +40306,7 @@
                 <w:sz w:val="20"/>
                 <w:szCs w:val="20"/>
               </w:rPr>
-              <w:t xml:space="preserve">allowance = float(input("Enter weekly allowance: "))</w:t>
+              <w:t xml:space="preserve">allowance = float(input("Enter daily allowance: "))</w:t>
             </w:r>
           </w:p>
           <w:p>
@@ -40333,7 +40319,7 @@
                 <w:sz w:val="20"/>
                 <w:szCs w:val="20"/>
               </w:rPr>
-              <w:t xml:space="preserve">fare = float(input("Enter transportation expenses: "))</w:t>
+              <w:t xml:space="preserve">fare = float(input("Enter jeepney fare: "))</w:t>
             </w:r>
           </w:p>
           <w:p>
@@ -40346,7 +40332,7 @@
                 <w:sz w:val="20"/>
                 <w:szCs w:val="20"/>
               </w:rPr>
-              <w:t xml:space="preserve">food = float(input("Enter food expenses: "))</w:t>
+              <w:t xml:space="preserve">snacks = float(input("Enter snacks expense: "))</w:t>
             </w:r>
           </w:p>
           <w:p>
@@ -40359,7 +40345,7 @@
                 <w:sz w:val="20"/>
                 <w:szCs w:val="20"/>
               </w:rPr>
-              <w:t xml:space="preserve">load = float(input("Enter load/internet expenses: "))</w:t>
+              <w:t xml:space="preserve">printing = float(input("Enter printing expense: "))</w:t>
             </w:r>
           </w:p>
           <w:p>
@@ -40385,7 +40371,7 @@
                 <w:sz w:val="20"/>
                 <w:szCs w:val="20"/>
               </w:rPr>
-              <w:t xml:space="preserve">remaining = allowance - fare - food - load</w:t>
+              <w:t xml:space="preserve">remaining = allowance - fare - snacks - printing</w:t>
             </w:r>
           </w:p>
           <w:p>
@@ -40488,7 +40474,7 @@
                 <w:sz w:val="20"/>
                 <w:szCs w:val="20"/>
               </w:rPr>
-              <w:t xml:space="preserve">Remaining Allowance: ₱120.00</w:t>
+              <w:t xml:space="preserve">Remaining Allowance: ₱100.00</w:t>
             </w:r>
           </w:p>
         </w:tc>
@@ -40508,7 +40494,7 @@
         <w:rPr>
           <w:rFonts w:ascii="Arial" w:cs="Arial" w:eastAsia="Arial" w:hAnsi="Arial"/>
         </w:rPr>
-        <w:t xml:space="preserve">G8: Distance Traveled Using Speed and Time</w:t>
+        <w:t xml:space="preserve">G8: Distance Covered While Jogging</w:t>
       </w:r>
     </w:p>
     <w:p>
@@ -40696,7 +40682,7 @@
                 <w:sz w:val="24"/>
                 <w:szCs w:val="24"/>
               </w:rPr>
-              <w:t xml:space="preserve">Average speed and travel time</w:t>
+              <w:t xml:space="preserve">Average speed and jogging time</w:t>
             </w:r>
           </w:p>
         </w:tc>
@@ -40760,7 +40746,7 @@
                 <w:sz w:val="24"/>
                 <w:szCs w:val="24"/>
               </w:rPr>
-              <w:t xml:space="preserve">Distance traveled</w:t>
+              <w:t xml:space="preserve">Distance covered</w:t>
             </w:r>
           </w:p>
         </w:tc>
@@ -40847,7 +40833,7 @@
           <w:sz w:val="24"/>
           <w:szCs w:val="24"/>
         </w:rPr>
-        <w:t xml:space="preserve">3. Input the travel time.</w:t>
+        <w:t xml:space="preserve">3. Input the jogging time.</w:t>
       </w:r>
     </w:p>
     <w:p>
@@ -40865,7 +40851,7 @@
           <w:sz w:val="24"/>
           <w:szCs w:val="24"/>
         </w:rPr>
-        <w:t xml:space="preserve">4. Compute the distance traveled.</w:t>
+        <w:t xml:space="preserve">4. Compute the distance covered.</w:t>
       </w:r>
     </w:p>
     <w:p>
@@ -40883,7 +40869,7 @@
           <w:sz w:val="24"/>
           <w:szCs w:val="24"/>
         </w:rPr>
-        <w:t xml:space="preserve">5. Display the distance traveled.</w:t>
+        <w:t xml:space="preserve">5. Display the distance covered.</w:t>
       </w:r>
     </w:p>
     <w:p>
@@ -41205,7 +41191,7 @@
                 <w:sz w:val="20"/>
                 <w:szCs w:val="20"/>
               </w:rPr>
-              <w:t xml:space="preserve">time = float(input("Enter travel time (hours): "))</w:t>
+              <w:t xml:space="preserve">time = float(input("Enter jogging time (hours): "))</w:t>
             </w:r>
           </w:p>
           <w:p>
@@ -41334,7 +41320,7 @@
                 <w:sz w:val="20"/>
                 <w:szCs w:val="20"/>
               </w:rPr>
-              <w:t xml:space="preserve">Distance: 140.00 km</w:t>
+              <w:t xml:space="preserve">Distance: 7.80 km</w:t>
             </w:r>
           </w:p>
         </w:tc>
@@ -41354,7 +41340,7 @@
         <w:rPr>
           <w:rFonts w:ascii="Arial" w:cs="Arial" w:eastAsia="Arial" w:hAnsi="Arial"/>
         </w:rPr>
-        <w:t xml:space="preserve">G9: Simple Interest on a Savings Deposit</w:t>
+        <w:t xml:space="preserve">G9: Simple Interest on a Time Deposit</w:t>
       </w:r>
     </w:p>
     <w:p>
@@ -42281,7 +42267,7 @@
                 <w:sz w:val="20"/>
                 <w:szCs w:val="20"/>
               </w:rPr>
-              <w:t xml:space="preserve">Interest: ₱1500.00</w:t>
+              <w:t xml:space="preserve">Interest: ₱3000.00</w:t>
             </w:r>
           </w:p>
           <w:p>
@@ -42294,7 +42280,7 @@
                 <w:sz w:val="20"/>
                 <w:szCs w:val="20"/>
               </w:rPr>
-              <w:t xml:space="preserve">Total Amount: ₱16500.00</w:t>
+              <w:t xml:space="preserve">Total Amount: ₱28000.00</w:t>
             </w:r>
           </w:p>
         </w:tc>
@@ -43140,7 +43126,7 @@
                 <w:sz w:val="20"/>
                 <w:szCs w:val="20"/>
               </w:rPr>
-              <w:t xml:space="preserve">Electricity Cost: ₱4025.00</w:t>
+              <w:t xml:space="preserve">Electricity Cost: ₱3010.00</w:t>
             </w:r>
           </w:p>
         </w:tc>
@@ -43160,7 +43146,7 @@
         <w:rPr>
           <w:rFonts w:ascii="Arial" w:cs="Arial" w:eastAsia="Arial" w:hAnsi="Arial"/>
         </w:rPr>
-        <w:t xml:space="preserve">G11: Total Cost of Computer Components</w:t>
+        <w:t xml:space="preserve">G11: Total Cost of Computer Peripherals</w:t>
       </w:r>
     </w:p>
     <w:p>
@@ -43348,7 +43334,7 @@
                 <w:sz w:val="24"/>
                 <w:szCs w:val="24"/>
               </w:rPr>
-              <w:t xml:space="preserve">Prices of the CPU, RAM, SSD, and monitor</w:t>
+              <w:t xml:space="preserve">Prices of the keyboard, mouse, webcam, and headset</w:t>
             </w:r>
           </w:p>
         </w:tc>
@@ -43380,7 +43366,7 @@
                 <w:sz w:val="24"/>
                 <w:szCs w:val="24"/>
               </w:rPr>
-              <w:t xml:space="preserve">Add the four component prices together</w:t>
+              <w:t xml:space="preserve">Add the four peripheral prices together</w:t>
             </w:r>
           </w:p>
         </w:tc>
@@ -43481,7 +43467,7 @@
           <w:sz w:val="24"/>
           <w:szCs w:val="24"/>
         </w:rPr>
-        <w:t xml:space="preserve">2. Input the CPU price.</w:t>
+        <w:t xml:space="preserve">2. Input the keyboard price.</w:t>
       </w:r>
     </w:p>
     <w:p>
@@ -43499,7 +43485,7 @@
           <w:sz w:val="24"/>
           <w:szCs w:val="24"/>
         </w:rPr>
-        <w:t xml:space="preserve">3. Input the RAM price.</w:t>
+        <w:t xml:space="preserve">3. Input the mouse price.</w:t>
       </w:r>
     </w:p>
     <w:p>
@@ -43517,7 +43503,7 @@
           <w:sz w:val="24"/>
           <w:szCs w:val="24"/>
         </w:rPr>
-        <w:t xml:space="preserve">4. Input the SSD price.</w:t>
+        <w:t xml:space="preserve">4. Input the webcam price.</w:t>
       </w:r>
     </w:p>
     <w:p>
@@ -43535,7 +43521,7 @@
           <w:sz w:val="24"/>
           <w:szCs w:val="24"/>
         </w:rPr>
-        <w:t xml:space="preserve">5. Input the monitor price.</w:t>
+        <w:t xml:space="preserve">5. Input the headset price.</w:t>
       </w:r>
     </w:p>
     <w:p>
@@ -43681,7 +43667,7 @@
                 <w:sz w:val="20"/>
                 <w:szCs w:val="20"/>
               </w:rPr>
-              <w:t xml:space="preserve">INPUT cpu_price</w:t>
+              <w:t xml:space="preserve">INPUT keyboard_price</w:t>
             </w:r>
           </w:p>
           <w:p>
@@ -43694,7 +43680,7 @@
                 <w:sz w:val="20"/>
                 <w:szCs w:val="20"/>
               </w:rPr>
-              <w:t xml:space="preserve">INPUT ram_price</w:t>
+              <w:t xml:space="preserve">INPUT mouse_price</w:t>
             </w:r>
           </w:p>
           <w:p>
@@ -43707,7 +43693,7 @@
                 <w:sz w:val="20"/>
                 <w:szCs w:val="20"/>
               </w:rPr>
-              <w:t xml:space="preserve">INPUT ssd_price</w:t>
+              <w:t xml:space="preserve">INPUT webcam_price</w:t>
             </w:r>
           </w:p>
           <w:p>
@@ -43720,7 +43706,7 @@
                 <w:sz w:val="20"/>
                 <w:szCs w:val="20"/>
               </w:rPr>
-              <w:t xml:space="preserve">INPUT monitor_price</w:t>
+              <w:t xml:space="preserve">INPUT headset_price</w:t>
             </w:r>
           </w:p>
           <w:p>
@@ -43733,7 +43719,7 @@
                 <w:sz w:val="20"/>
                 <w:szCs w:val="20"/>
               </w:rPr>
-              <w:t xml:space="preserve">total_cost = cpu_price + ram_price + ssd_price + monitor_price</w:t>
+              <w:t xml:space="preserve">total_cost = keyboard_price + mouse_price + webcam_price + headset_price</w:t>
             </w:r>
           </w:p>
           <w:p>
@@ -43797,7 +43783,7 @@
       <w:r>
         <w:drawing>
           <wp:inline distT="0" distB="0" distL="0" distR="0">
-            <wp:extent cx="2476500" cy="3686175"/>
+            <wp:extent cx="2476500" cy="3867150"/>
             <wp:effectExtent t="0" r="0" b="0" l="0"/>
             <wp:docPr id="1" name="" descr="" title=""/>
             <wp:cNvGraphicFramePr>
@@ -43822,7 +43808,7 @@
                   <pic:spPr bwMode="auto">
                     <a:xfrm>
                       <a:off x="0" y="0"/>
-                      <a:ext cx="2476500" cy="3686175"/>
+                      <a:ext cx="2476500" cy="3867150"/>
                     </a:xfrm>
                     <a:prstGeom prst="rect">
                       <a:avLst/>
@@ -43906,7 +43892,7 @@
                 <w:sz w:val="20"/>
                 <w:szCs w:val="20"/>
               </w:rPr>
-              <w:t xml:space="preserve">cpu_price = float(input("Enter CPU price: "))</w:t>
+              <w:t xml:space="preserve">keyboard_price = float(input("Enter keyboard price: "))</w:t>
             </w:r>
           </w:p>
           <w:p>
@@ -43919,7 +43905,7 @@
                 <w:sz w:val="20"/>
                 <w:szCs w:val="20"/>
               </w:rPr>
-              <w:t xml:space="preserve">ram_price = float(input("Enter RAM price: "))</w:t>
+              <w:t xml:space="preserve">mouse_price = float(input("Enter mouse price: "))</w:t>
             </w:r>
           </w:p>
           <w:p>
@@ -43932,7 +43918,7 @@
                 <w:sz w:val="20"/>
                 <w:szCs w:val="20"/>
               </w:rPr>
-              <w:t xml:space="preserve">ssd_price = float(input("Enter SSD price: "))</w:t>
+              <w:t xml:space="preserve">webcam_price = float(input("Enter webcam price: "))</w:t>
             </w:r>
           </w:p>
           <w:p>
@@ -43945,7 +43931,7 @@
                 <w:sz w:val="20"/>
                 <w:szCs w:val="20"/>
               </w:rPr>
-              <w:t xml:space="preserve">monitor_price = float(input("Enter monitor price: "))</w:t>
+              <w:t xml:space="preserve">headset_price = float(input("Enter headset price: "))</w:t>
             </w:r>
           </w:p>
           <w:p>
@@ -43971,7 +43957,7 @@
                 <w:sz w:val="20"/>
                 <w:szCs w:val="20"/>
               </w:rPr>
-              <w:t xml:space="preserve">total_cost = cpu_price + ram_price + ssd_price + monitor_price</w:t>
+              <w:t xml:space="preserve">total_cost = keyboard_price + mouse_price + webcam_price + headset_price</w:t>
             </w:r>
           </w:p>
           <w:p>
@@ -44074,7 +44060,7 @@
                 <w:sz w:val="20"/>
                 <w:szCs w:val="20"/>
               </w:rPr>
-              <w:t xml:space="preserve">Total Cost: ₱20300.00</w:t>
+              <w:t xml:space="preserve">Total Cost: ₱4600.00</w:t>
             </w:r>
           </w:p>
         </w:tc>
@@ -44933,7 +44919,7 @@
                 <w:sz w:val="20"/>
                 <w:szCs w:val="20"/>
               </w:rPr>
-              <w:t xml:space="preserve">Hours: 4</w:t>
+              <w:t xml:space="preserve">Hours: 5</w:t>
             </w:r>
           </w:p>
           <w:p>
@@ -44946,7 +44932,7 @@
                 <w:sz w:val="20"/>
                 <w:szCs w:val="20"/>
               </w:rPr>
-              <w:t xml:space="preserve">Minutes: 17</w:t>
+              <w:t xml:space="preserve">Minutes: 19</w:t>
             </w:r>
           </w:p>
         </w:tc>

</xml_diff>